<commit_message>
Update resume content for clarity and consistency across sections
</commit_message>
<xml_diff>
--- a/public/Resume Mayank Kantharia.docx
+++ b/public/Resume Mayank Kantharia.docx
@@ -429,21 +429,7 @@
         <w:rPr>
           <w:rFonts w:ascii="Lato" w:hAnsi="Lato" w:cs="Times New Roman"/>
         </w:rPr>
-        <w:t xml:space="preserve"> Python, R, </w:t>
-      </w:r>
-      <w:proofErr w:type="spellStart"/>
-      <w:r>
-        <w:rPr>
-          <w:rFonts w:ascii="Lato" w:hAnsi="Lato" w:cs="Times New Roman"/>
-        </w:rPr>
-        <w:t>FastAPI</w:t>
-      </w:r>
-      <w:proofErr w:type="spellEnd"/>
-      <w:r>
-        <w:rPr>
-          <w:rFonts w:ascii="Lato" w:hAnsi="Lato" w:cs="Times New Roman"/>
-        </w:rPr>
-        <w:t>, Flask, Django, SQL, TypeScript (Next.js components)</w:t>
+        <w:t xml:space="preserve"> Python, R, FastAPI, Flask, Django, SQL, TypeScript (Next.js components)</w:t>
       </w:r>
     </w:p>
     <w:p>
@@ -466,21 +452,7 @@
         <w:rPr>
           <w:rFonts w:ascii="Lato" w:hAnsi="Lato" w:cs="Times New Roman"/>
         </w:rPr>
-        <w:t xml:space="preserve"> OpenAI API (GPT-4o embeddings), vector search (</w:t>
-      </w:r>
-      <w:proofErr w:type="spellStart"/>
-      <w:r>
-        <w:rPr>
-          <w:rFonts w:ascii="Lato" w:hAnsi="Lato" w:cs="Times New Roman"/>
-        </w:rPr>
-        <w:t>pgvector</w:t>
-      </w:r>
-      <w:proofErr w:type="spellEnd"/>
-      <w:r>
-        <w:rPr>
-          <w:rFonts w:ascii="Lato" w:hAnsi="Lato" w:cs="Times New Roman"/>
-        </w:rPr>
-        <w:t>), semantic re-ranking, skill-gap analysis, AI agent workflows</w:t>
+        <w:t xml:space="preserve"> OpenAI API (GPT-4o embeddings), vector search (pgvector), semantic re-ranking, skill-gap analysis, AI agent workflows</w:t>
       </w:r>
     </w:p>
     <w:p>
@@ -503,21 +475,7 @@
         <w:rPr>
           <w:rFonts w:ascii="Lato" w:hAnsi="Lato" w:cs="Times New Roman"/>
         </w:rPr>
-        <w:t xml:space="preserve"> AWS (EC2, S3, DynamoDB, Lambda, API Gateway), REST API design &amp; development, </w:t>
-      </w:r>
-      <w:proofErr w:type="spellStart"/>
-      <w:r>
-        <w:rPr>
-          <w:rFonts w:ascii="Lato" w:hAnsi="Lato" w:cs="Times New Roman"/>
-        </w:rPr>
-        <w:t>Supabase</w:t>
-      </w:r>
-      <w:proofErr w:type="spellEnd"/>
-      <w:r>
-        <w:rPr>
-          <w:rFonts w:ascii="Lato" w:hAnsi="Lato" w:cs="Times New Roman"/>
-        </w:rPr>
-        <w:t>, Google Calendar API, Outlook Calendar API</w:t>
+        <w:t xml:space="preserve"> AWS (EC2, S3, DynamoDB, Lambda, API Gateway), REST API design &amp; development, Supabase, Google Calendar API, Outlook Calendar API</w:t>
       </w:r>
     </w:p>
     <w:p>
@@ -563,16 +521,8 @@
         <w:rPr>
           <w:rFonts w:ascii="Lato" w:hAnsi="Lato" w:cs="Times New Roman"/>
         </w:rPr>
-        <w:t xml:space="preserve"> MySQL, MongoDB, PostgreSQL, </w:t>
+        <w:t xml:space="preserve"> MySQL, MongoDB, PostgreSQL, pgvector</w:t>
       </w:r>
-      <w:proofErr w:type="spellStart"/>
-      <w:r>
-        <w:rPr>
-          <w:rFonts w:ascii="Lato" w:hAnsi="Lato" w:cs="Times New Roman"/>
-        </w:rPr>
-        <w:t>pgvector</w:t>
-      </w:r>
-      <w:proofErr w:type="spellEnd"/>
     </w:p>
     <w:p>
       <w:pPr>
@@ -582,23 +532,13 @@
           <w:rFonts w:ascii="Lato" w:hAnsi="Lato" w:cs="Times New Roman"/>
         </w:rPr>
       </w:pPr>
-      <w:proofErr w:type="spellStart"/>
       <w:r>
         <w:rPr>
           <w:rFonts w:ascii="Lato" w:hAnsi="Lato" w:cs="Times New Roman"/>
           <w:b/>
           <w:bCs/>
         </w:rPr>
-        <w:t>Visualisation</w:t>
-      </w:r>
-      <w:proofErr w:type="spellEnd"/>
-      <w:r>
-        <w:rPr>
-          <w:rFonts w:ascii="Lato" w:hAnsi="Lato" w:cs="Times New Roman"/>
-          <w:b/>
-          <w:bCs/>
-        </w:rPr>
-        <w:t xml:space="preserve"> &amp; BI:</w:t>
+        <w:t>Visualisation &amp; BI:</w:t>
       </w:r>
       <w:r>
         <w:rPr>
@@ -626,16 +566,8 @@
         <w:rPr>
           <w:rFonts w:ascii="Lato" w:hAnsi="Lato" w:cs="Times New Roman"/>
         </w:rPr>
-        <w:t xml:space="preserve"> Detail-oriented, analytical thinker, clear communicator, adaptable collaborator, well-</w:t>
+        <w:t xml:space="preserve"> Detail-oriented, analytical thinker, clear communicator, adaptable collaborator, well-organised</w:t>
       </w:r>
-      <w:proofErr w:type="spellStart"/>
-      <w:r>
-        <w:rPr>
-          <w:rFonts w:ascii="Lato" w:hAnsi="Lato" w:cs="Times New Roman"/>
-        </w:rPr>
-        <w:t>organised</w:t>
-      </w:r>
-      <w:proofErr w:type="spellEnd"/>
     </w:p>
     <w:p>
       <w:pPr>
@@ -824,35 +756,7 @@
         <w:rPr>
           <w:rFonts w:ascii="Lato" w:hAnsi="Lato" w:cs="Times New Roman"/>
         </w:rPr>
-        <w:t xml:space="preserve">Built end-to-end RAG-based career guidance modules using GPT-4o embeddings and </w:t>
-      </w:r>
-      <w:proofErr w:type="spellStart"/>
-      <w:r>
-        <w:rPr>
-          <w:rFonts w:ascii="Lato" w:hAnsi="Lato" w:cs="Times New Roman"/>
-        </w:rPr>
-        <w:t>Supabase</w:t>
-      </w:r>
-      <w:proofErr w:type="spellEnd"/>
-      <w:r>
-        <w:rPr>
-          <w:rFonts w:ascii="Lato" w:hAnsi="Lato" w:cs="Times New Roman"/>
-        </w:rPr>
-        <w:t xml:space="preserve"> </w:t>
-      </w:r>
-      <w:proofErr w:type="spellStart"/>
-      <w:r>
-        <w:rPr>
-          <w:rFonts w:ascii="Lato" w:hAnsi="Lato" w:cs="Times New Roman"/>
-        </w:rPr>
-        <w:t>pgvector</w:t>
-      </w:r>
-      <w:proofErr w:type="spellEnd"/>
-      <w:r>
-        <w:rPr>
-          <w:rFonts w:ascii="Lato" w:hAnsi="Lato" w:cs="Times New Roman"/>
-        </w:rPr>
-        <w:t xml:space="preserve"> to generate personalized role recommendations and learning roadmaps.</w:t>
+        <w:t>Built end-to-end RAG-based career guidance modules using GPT-4o embeddings and Supabase pgvector to generate personalized role recommendations and learning roadmaps</w:t>
       </w:r>
     </w:p>
     <w:p>
@@ -871,21 +775,7 @@
         <w:rPr>
           <w:rFonts w:ascii="Lato" w:hAnsi="Lato" w:cs="Times New Roman"/>
         </w:rPr>
-        <w:t xml:space="preserve">Developed </w:t>
-      </w:r>
-      <w:proofErr w:type="spellStart"/>
-      <w:r>
-        <w:rPr>
-          <w:rFonts w:ascii="Lato" w:hAnsi="Lato" w:cs="Times New Roman"/>
-        </w:rPr>
-        <w:t>FastAPI</w:t>
-      </w:r>
-      <w:proofErr w:type="spellEnd"/>
-      <w:r>
-        <w:rPr>
-          <w:rFonts w:ascii="Lato" w:hAnsi="Lato" w:cs="Times New Roman"/>
-        </w:rPr>
-        <w:t xml:space="preserve"> ML services for retrieval, semantic re-ranking, enrichment-pack generation, and skill-gap analysis, achieving 3 second end-to-end latency and 5 millisecond vector searches.</w:t>
+        <w:t>Developed FastAPI ML services for retrieval, semantic re-ranking, enrichment-pack generation, and skill-gap analysis, achieving 3 second end-to-end latency and 5 millisecond vector searches</w:t>
       </w:r>
     </w:p>
     <w:p>
@@ -904,7 +794,7 @@
         <w:rPr>
           <w:rFonts w:ascii="Lato" w:hAnsi="Lato" w:cs="Times New Roman"/>
         </w:rPr>
-        <w:t>Expanded internal datasets from 200 to 960 roles via automated web scraping and metadata enrichment, improving coverage and contextual accuracy.</w:t>
+        <w:t>Expanded internal datasets from 200 to 960 roles via automated web scraping and metadata enrichment, improving coverage and contextual accuracy</w:t>
       </w:r>
     </w:p>
     <w:p>
@@ -923,7 +813,7 @@
         <w:rPr>
           <w:rFonts w:ascii="Lato" w:hAnsi="Lato" w:cs="Times New Roman"/>
         </w:rPr>
-        <w:t>Integrated Google and Outlook Calendar APIs and contributed to Next.js and TypeScript components for roadmap visualization while collaborating in a 5-member Agile team.</w:t>
+        <w:t>Integrated Google and Outlook Calendar APIs and contributed to Next.js and TypeScript components for roadmap visualization while collaborating in a 5-member Agile team</w:t>
       </w:r>
     </w:p>
     <w:p>
@@ -943,7 +833,7 @@
         <w:rPr>
           <w:rFonts w:ascii="Lato" w:hAnsi="Lato" w:cs="Times New Roman"/>
         </w:rPr>
-        <w:t>Implemented logging, monitoring, and evaluation scripts to support iterative experimentation and system reliability.</w:t>
+        <w:t>Implemented logging, monitoring, and evaluation scripts to support iterative experimentation and system reliability</w:t>
       </w:r>
     </w:p>
     <w:p>
@@ -1133,7 +1023,7 @@
         <w:rPr>
           <w:rFonts w:ascii="Lato" w:hAnsi="Lato" w:cs="Times New Roman"/>
         </w:rPr>
-        <w:t>Developed a fully deployed cloud application hosted on an EC2 Ubuntu server using Apache2, accessible via public DNS.</w:t>
+        <w:t>Developed a fully deployed cloud application hosted on an EC2 Ubuntu server using Apache2, accessible via public DNS</w:t>
       </w:r>
     </w:p>
     <w:p>
@@ -1153,7 +1043,7 @@
         <w:rPr>
           <w:rFonts w:ascii="Lato" w:hAnsi="Lato" w:cs="Times New Roman"/>
         </w:rPr>
-        <w:t>Designed and implemented DynamoDB schemas for login, music, and subscription data with optimized key structures.</w:t>
+        <w:t>Designed and implemented DynamoDB schemas for login, music, and subscription data with optimized key structures</w:t>
       </w:r>
     </w:p>
     <w:p>
@@ -1173,7 +1063,7 @@
         <w:rPr>
           <w:rFonts w:ascii="Lato" w:hAnsi="Lato" w:cs="Times New Roman"/>
         </w:rPr>
-        <w:t>Built backend logic for login, registration, subscription management, and music queries using DynamoDB read/write operations.</w:t>
+        <w:t>Built backend logic for login, registration, subscription management, and music queries using DynamoDB read/write operations</w:t>
       </w:r>
     </w:p>
     <w:p>
@@ -1193,7 +1083,7 @@
         <w:rPr>
           <w:rFonts w:ascii="Lato" w:hAnsi="Lato" w:cs="Times New Roman"/>
         </w:rPr>
-        <w:t>Automated image retrieval and upload by downloading artist images and storing them securely in S3.</w:t>
+        <w:t>Automated image retrieval and upload by downloading artist images and storing them securely in S3</w:t>
       </w:r>
     </w:p>
     <w:p>
@@ -1225,7 +1115,7 @@
         <w:rPr>
           <w:rFonts w:ascii="Lato" w:hAnsi="Lato" w:cs="Times New Roman"/>
         </w:rPr>
-        <w:t xml:space="preserve"> Lambda to process user registration, subscription updates, and data retrieval through REST APIs.</w:t>
+        <w:t xml:space="preserve"> Lambda to process user registration, subscription updates, and data retrieval through REST APIs</w:t>
       </w:r>
     </w:p>
     <w:p>
@@ -1270,7 +1160,7 @@
         <w:rPr>
           <w:rFonts w:ascii="Lato" w:hAnsi="Lato" w:cs="Times New Roman"/>
         </w:rPr>
-        <w:t>end cloud solution demonstrating scalable architecture and AWS best practices.</w:t>
+        <w:t>end cloud solution demonstrating scalable architecture and AWS best practices</w:t>
       </w:r>
     </w:p>
     <w:p>
@@ -1319,23 +1209,13 @@
         </w:rPr>
         <w:t xml:space="preserve">War | </w:t>
       </w:r>
-      <w:proofErr w:type="gramStart"/>
       <w:r>
         <w:rPr>
           <w:rFonts w:ascii="Lato" w:hAnsi="Lato" w:cs="Times New Roman"/>
           <w:bCs/>
           <w:color w:val="000000" w:themeColor="text1"/>
         </w:rPr>
-        <w:t>Social Media</w:t>
-      </w:r>
-      <w:proofErr w:type="gramEnd"/>
-      <w:r>
-        <w:rPr>
-          <w:rFonts w:ascii="Lato" w:hAnsi="Lato" w:cs="Times New Roman"/>
-          <w:bCs/>
-          <w:color w:val="000000" w:themeColor="text1"/>
-        </w:rPr>
-        <w:t xml:space="preserve"> &amp; Network Analysis (Reddit + YouTube)</w:t>
+        <w:t>Social Media &amp; Network Analysis (Reddit + YouTube)</w:t>
       </w:r>
       <w:r>
         <w:rPr>
@@ -1366,25 +1246,7 @@
           <w:i/>
           <w:iCs/>
         </w:rPr>
-        <w:t xml:space="preserve">Python, PRAW, YouTube API, NLP, LDA, VADER, </w:t>
-      </w:r>
-      <w:proofErr w:type="spellStart"/>
-      <w:r>
-        <w:rPr>
-          <w:rFonts w:ascii="Lato" w:hAnsi="Lato" w:cs="Times New Roman"/>
-          <w:i/>
-          <w:iCs/>
-        </w:rPr>
-        <w:t>NetworkX</w:t>
-      </w:r>
-      <w:proofErr w:type="spellEnd"/>
-      <w:r>
-        <w:rPr>
-          <w:rFonts w:ascii="Lato" w:hAnsi="Lato" w:cs="Times New Roman"/>
-          <w:i/>
-          <w:iCs/>
-        </w:rPr>
-        <w:t>, Louvain</w:t>
+        <w:t>Python, PRAW, YouTube API, NLP, LDA, VADER, NetworkX, Louvain</w:t>
       </w:r>
     </w:p>
     <w:p>
@@ -1405,7 +1267,7 @@
           <w:rFonts w:ascii="Lato" w:hAnsi="Lato" w:cs="Times New Roman"/>
         </w:rPr>
         <w:lastRenderedPageBreak/>
-        <w:t>Collected and processed 90,000 comments from Reddit and YouTube, performing large-scale cleaning and preprocessing.</w:t>
+        <w:t>Collected and processed 90,000 comments from Reddit and YouTube, performing large-scale cleaning and preprocessing</w:t>
       </w:r>
     </w:p>
     <w:p>
@@ -1425,7 +1287,7 @@
         <w:rPr>
           <w:rFonts w:ascii="Lato" w:hAnsi="Lato" w:cs="Times New Roman"/>
         </w:rPr>
-        <w:t>Built an NLP pipeline for sentiment analysis and LDA topic modeling to surface actionable insights.</w:t>
+        <w:t>Built an NLP pipeline for sentiment analysis and LDA topic modeling to surface actionable insights</w:t>
       </w:r>
     </w:p>
     <w:p>
@@ -1445,7 +1307,7 @@
         <w:rPr>
           <w:rFonts w:ascii="Lato" w:hAnsi="Lato" w:cs="Times New Roman"/>
         </w:rPr>
-        <w:t>Constructed interaction graphs, applied Louvain community detection, and simulated information diffusion using the Independent Cascade model.</w:t>
+        <w:t>Constructed interaction graphs, applied Louvain community detection, and simulated information diffusion using the Independent Cascade model</w:t>
       </w:r>
     </w:p>
     <w:p>
@@ -1466,12 +1328,13 @@
         <w:rPr>
           <w:rFonts w:ascii="Lato" w:hAnsi="Lato" w:cs="Times New Roman"/>
         </w:rPr>
-        <w:t>Generated insights on sentiment polarization, topic diversity, and narrative spread across platforms.</w:t>
+        <w:t>Generated insights on sentiment polarization, topic diversity, and narrative spread across platforms</w:t>
       </w:r>
     </w:p>
     <w:p>
       <w:pPr>
         <w:pStyle w:val="Heading2"/>
+        <w:spacing w:before="0" w:after="80"/>
         <w:rPr>
           <w:rFonts w:ascii="Lato" w:hAnsi="Lato" w:cs="Times New Roman"/>
         </w:rPr>
@@ -1503,25 +1366,7 @@
           <w:i/>
           <w:iCs/>
         </w:rPr>
-        <w:t xml:space="preserve">TensorFlow, </w:t>
-      </w:r>
-      <w:proofErr w:type="spellStart"/>
-      <w:r>
-        <w:rPr>
-          <w:rFonts w:ascii="Lato" w:hAnsi="Lato" w:cs="Times New Roman"/>
-          <w:i/>
-          <w:iCs/>
-        </w:rPr>
-        <w:t>FastText</w:t>
-      </w:r>
-      <w:proofErr w:type="spellEnd"/>
-      <w:r>
-        <w:rPr>
-          <w:rFonts w:ascii="Lato" w:hAnsi="Lato" w:cs="Times New Roman"/>
-          <w:i/>
-          <w:iCs/>
-        </w:rPr>
-        <w:t>, TF</w:t>
+        <w:t>TensorFlow, FastText, TF</w:t>
       </w:r>
       <w:r>
         <w:rPr>
@@ -1574,7 +1419,7 @@
         <w:rPr>
           <w:rFonts w:ascii="Lato" w:hAnsi="Lato" w:cs="Times New Roman"/>
         </w:rPr>
-        <w:t>end NLP pipelines for classifying product recommendations using text reviews.</w:t>
+        <w:t>end NLP pipelines for classifying product recommendations using text reviews</w:t>
       </w:r>
     </w:p>
     <w:p>
@@ -1594,21 +1439,7 @@
         <w:rPr>
           <w:rFonts w:ascii="Lato" w:hAnsi="Lato" w:cs="Times New Roman"/>
         </w:rPr>
-        <w:t xml:space="preserve">Implemented preprocessing: regex tokenization, </w:t>
-      </w:r>
-      <w:proofErr w:type="spellStart"/>
-      <w:r>
-        <w:rPr>
-          <w:rFonts w:ascii="Lato" w:hAnsi="Lato" w:cs="Times New Roman"/>
-        </w:rPr>
-        <w:t>stopword</w:t>
-      </w:r>
-      <w:proofErr w:type="spellEnd"/>
-      <w:r>
-        <w:rPr>
-          <w:rFonts w:ascii="Lato" w:hAnsi="Lato" w:cs="Times New Roman"/>
-        </w:rPr>
-        <w:t xml:space="preserve"> removal, rare</w:t>
+        <w:t>Implemented preprocessing: regex tokenization, stopword removal, rare</w:t>
       </w:r>
       <w:r>
         <w:rPr>
@@ -1620,7 +1451,7 @@
         <w:rPr>
           <w:rFonts w:ascii="Lato" w:hAnsi="Lato" w:cs="Times New Roman"/>
         </w:rPr>
-        <w:t>word filtering, vocabulary creation.</w:t>
+        <w:t>word filtering, vocabulary creation</w:t>
       </w:r>
     </w:p>
     <w:p>
@@ -1688,7 +1519,7 @@
         <w:rPr>
           <w:rFonts w:ascii="Lato" w:hAnsi="Lato" w:cs="Times New Roman"/>
         </w:rPr>
-        <w:t>based document vectors for model training.</w:t>
+        <w:t>based document vectors for model training</w:t>
       </w:r>
     </w:p>
     <w:p>
@@ -1745,7 +1576,7 @@
         <w:rPr>
           <w:rFonts w:ascii="Lato" w:hAnsi="Lato" w:cs="Times New Roman"/>
         </w:rPr>
-        <w:t>validation and evaluation metrics.</w:t>
+        <w:t>validation and evaluation metrics</w:t>
       </w:r>
     </w:p>
     <w:p>
@@ -1789,7 +1620,7 @@
         <w:rPr>
           <w:rFonts w:ascii="Lato" w:hAnsi="Lato" w:cs="Times New Roman"/>
         </w:rPr>
-        <w:t>time recommendation prediction.</w:t>
+        <w:t>time recommendation prediction</w:t>
       </w:r>
     </w:p>
     <w:p>
@@ -1822,12 +1653,13 @@
         <w:rPr>
           <w:rFonts w:ascii="Lato" w:hAnsi="Lato" w:cs="Times New Roman"/>
         </w:rPr>
-        <w:t>based search, item browsing, and user review submission with dynamic ML inference.</w:t>
+        <w:t>based search, item browsing, and user review submission with dynamic ML inference</w:t>
       </w:r>
     </w:p>
     <w:p>
       <w:pPr>
         <w:pStyle w:val="Heading2"/>
+        <w:spacing w:before="0" w:after="80"/>
         <w:rPr>
           <w:rFonts w:ascii="Lato" w:hAnsi="Lato" w:cs="Times New Roman"/>
         </w:rPr>
@@ -1836,7 +1668,26 @@
         <w:rPr>
           <w:rFonts w:ascii="Lato" w:hAnsi="Lato" w:cs="Times New Roman"/>
         </w:rPr>
-        <w:t>Research Based Project on Deep Learning | Final Year Project</w:t>
+        <w:t>Few</w:t>
+      </w:r>
+      <w:r>
+        <w:rPr>
+          <w:rFonts w:ascii="Lato" w:hAnsi="Lato" w:cs="Times New Roman"/>
+        </w:rPr>
+        <w:noBreakHyphen/>
+        <w:t>Shot Learning for Hyperspectral Data</w:t>
+      </w:r>
+      <w:r>
+        <w:rPr>
+          <w:rFonts w:ascii="Lato" w:hAnsi="Lato" w:cs="Times New Roman"/>
+        </w:rPr>
+        <w:t xml:space="preserve"> </w:t>
+      </w:r>
+      <w:r>
+        <w:rPr>
+          <w:rFonts w:ascii="Lato" w:hAnsi="Lato" w:cs="Times New Roman"/>
+        </w:rPr>
+        <w:t>| Final Year Project</w:t>
       </w:r>
       <w:r>
         <w:rPr>
@@ -1859,23 +1710,13 @@
           <w:iCs/>
         </w:rPr>
       </w:pPr>
-      <w:proofErr w:type="spellStart"/>
       <w:r>
         <w:rPr>
           <w:rFonts w:ascii="Lato" w:hAnsi="Lato" w:cs="Times New Roman"/>
           <w:i/>
           <w:iCs/>
         </w:rPr>
-        <w:t>PyTorch</w:t>
-      </w:r>
-      <w:proofErr w:type="spellEnd"/>
-      <w:r>
-        <w:rPr>
-          <w:rFonts w:ascii="Lato" w:hAnsi="Lato" w:cs="Times New Roman"/>
-          <w:i/>
-          <w:iCs/>
-        </w:rPr>
-        <w:t>, TensorFlow, Deep Learning, Attention Mechanisms</w:t>
+        <w:t>PyTorch, TensorFlow, Deep Learning, Attention Mechanisms</w:t>
       </w:r>
     </w:p>
     <w:bookmarkEnd w:id="1"/>
@@ -1939,7 +1780,7 @@
           <w:rFonts w:ascii="Lato" w:hAnsi="Lato" w:cs="Times New Roman"/>
           <w:lang w:val="en-AU"/>
         </w:rPr>
-        <w:t>spatial data, integrating Temperature Scaling and Attention mechanisms to improve predictive reliability.</w:t>
+        <w:t>spatial data, integrating Temperature Scaling and Attention mechanisms to improve predictive reliability</w:t>
       </w:r>
     </w:p>
     <w:p>
@@ -1960,7 +1801,7 @@
           <w:rFonts w:ascii="Lato" w:hAnsi="Lato" w:cs="Times New Roman"/>
           <w:lang w:val="en-AU"/>
         </w:rPr>
-        <w:t>Performed preprocessing and feature extraction on curated HSI datasets to address spectral–spatial variability and enhance model generalization.</w:t>
+        <w:t>Performed preprocessing and feature extraction on curated HSI datasets to address spectral–spatial variability and enhance model generalization</w:t>
       </w:r>
     </w:p>
     <w:p>
@@ -1996,7 +1837,7 @@
           <w:rFonts w:ascii="Lato" w:hAnsi="Lato" w:cs="Times New Roman"/>
           <w:lang w:val="en-AU"/>
         </w:rPr>
-        <w:t>validation and ablation studies to quantify the impact of architectural components and tuning strategies.</w:t>
+        <w:t>validation and ablation studies to quantify the impact of architectural components and tuning strategies</w:t>
       </w:r>
     </w:p>
     <w:p>
@@ -2118,7 +1959,7 @@
           <w:tab w:val="clear" w:pos="9360"/>
           <w:tab w:val="right" w:pos="10773"/>
         </w:tabs>
-        <w:spacing w:before="0" w:after="80"/>
+        <w:spacing w:before="0" w:after="40"/>
         <w:jc w:val="both"/>
         <w:rPr>
           <w:rFonts w:ascii="Lato" w:hAnsi="Lato" w:cs="Times New Roman"/>
@@ -2130,16 +1971,7 @@
           <w:rFonts w:ascii="Lato" w:hAnsi="Lato" w:cs="Times New Roman"/>
           <w:color w:val="000000" w:themeColor="text1"/>
         </w:rPr>
-        <w:t xml:space="preserve">RMIT University, Melbourne </w:t>
-      </w:r>
-      <w:r>
-        <w:rPr>
-          <w:rFonts w:ascii="Lato" w:hAnsi="Lato" w:cs="Times New Roman"/>
-          <w:b w:val="0"/>
-          <w:bCs/>
-          <w:color w:val="000000" w:themeColor="text1"/>
-        </w:rPr>
-        <w:t>(3.4/4 GPA)</w:t>
+        <w:t>RMIT University, Melbourne</w:t>
       </w:r>
       <w:r>
         <w:rPr>
@@ -2152,16 +1984,42 @@
     </w:p>
     <w:p>
       <w:pPr>
+        <w:pStyle w:val="Heading2"/>
+        <w:tabs>
+          <w:tab w:val="clear" w:pos="9360"/>
+          <w:tab w:val="right" w:pos="10773"/>
+        </w:tabs>
+        <w:spacing w:before="0" w:after="120"/>
         <w:jc w:val="both"/>
         <w:rPr>
           <w:rFonts w:ascii="Lato" w:hAnsi="Lato" w:cs="Times New Roman"/>
+          <w:color w:val="000000" w:themeColor="text1"/>
         </w:rPr>
       </w:pPr>
       <w:r>
         <w:rPr>
           <w:rFonts w:ascii="Lato" w:hAnsi="Lato" w:cs="Times New Roman"/>
+          <w:b w:val="0"/>
+          <w:bCs/>
+          <w:color w:val="000000" w:themeColor="text1"/>
         </w:rPr>
         <w:t>Master of Data Science</w:t>
+      </w:r>
+      <w:r>
+        <w:rPr>
+          <w:rFonts w:ascii="Lato" w:hAnsi="Lato" w:cs="Times New Roman"/>
+          <w:color w:val="000000" w:themeColor="text1"/>
+        </w:rPr>
+        <w:tab/>
+      </w:r>
+      <w:r>
+        <w:rPr>
+          <w:rFonts w:ascii="Lato" w:hAnsi="Lato" w:cs="Times New Roman"/>
+          <w:b w:val="0"/>
+          <w:bCs/>
+          <w:color w:val="000000" w:themeColor="text1"/>
+        </w:rPr>
+        <w:t>(3.4/4 GPA)</w:t>
       </w:r>
     </w:p>
     <w:p>
@@ -2171,7 +2029,7 @@
           <w:tab w:val="clear" w:pos="9360"/>
           <w:tab w:val="right" w:pos="10773"/>
         </w:tabs>
-        <w:spacing w:before="0" w:after="80"/>
+        <w:spacing w:before="0" w:after="40"/>
         <w:jc w:val="both"/>
         <w:rPr>
           <w:rFonts w:ascii="Lato" w:hAnsi="Lato" w:cs="Times New Roman"/>
@@ -2196,16 +2054,42 @@
     </w:p>
     <w:p>
       <w:pPr>
+        <w:pStyle w:val="Heading2"/>
+        <w:tabs>
+          <w:tab w:val="clear" w:pos="9360"/>
+          <w:tab w:val="right" w:pos="10773"/>
+        </w:tabs>
+        <w:spacing w:before="0" w:after="120"/>
         <w:jc w:val="both"/>
         <w:rPr>
           <w:rFonts w:ascii="Lato" w:hAnsi="Lato" w:cs="Times New Roman"/>
+          <w:color w:val="000000" w:themeColor="text1"/>
         </w:rPr>
       </w:pPr>
       <w:r>
         <w:rPr>
           <w:rFonts w:ascii="Lato" w:hAnsi="Lato" w:cs="Times New Roman"/>
+          <w:b w:val="0"/>
+          <w:bCs/>
+          <w:color w:val="000000" w:themeColor="text1"/>
         </w:rPr>
-        <w:t>Bachelor of Computer Engineering (8.96/10 GPA)</w:t>
+        <w:t>Bachelor of Computer Engineering</w:t>
+      </w:r>
+      <w:r>
+        <w:rPr>
+          <w:rFonts w:ascii="Lato" w:hAnsi="Lato" w:cs="Times New Roman"/>
+          <w:color w:val="000000" w:themeColor="text1"/>
+        </w:rPr>
+        <w:tab/>
+      </w:r>
+      <w:r>
+        <w:rPr>
+          <w:rFonts w:ascii="Lato" w:hAnsi="Lato" w:cs="Times New Roman"/>
+          <w:b w:val="0"/>
+          <w:bCs/>
+          <w:color w:val="000000" w:themeColor="text1"/>
+        </w:rPr>
+        <w:t>(8.96/10 GPA)</w:t>
       </w:r>
     </w:p>
     <w:p>
@@ -29778,12 +29662,14 @@
     <w:rsid w:val="00232DDE"/>
     <w:rsid w:val="002B493B"/>
     <w:rsid w:val="002E003B"/>
+    <w:rsid w:val="002E0C39"/>
     <w:rsid w:val="002E4C8F"/>
     <w:rsid w:val="00342027"/>
     <w:rsid w:val="0043450B"/>
     <w:rsid w:val="00444BA4"/>
     <w:rsid w:val="00476DF0"/>
     <w:rsid w:val="004A183C"/>
+    <w:rsid w:val="004E3344"/>
     <w:rsid w:val="005073E3"/>
     <w:rsid w:val="005377CD"/>
     <w:rsid w:val="005F4681"/>
@@ -30566,7 +30452,12 @@
 </file>
 
 <file path=customXml/item1.xml><?xml version="1.0" encoding="utf-8"?>
-<b:Sources xmlns:b="http://schemas.openxmlformats.org/officeDocument/2006/bibliography" xmlns="http://schemas.openxmlformats.org/officeDocument/2006/bibliography" SelectedStyle="\APASixthEditionOfficeOnline.xsl" StyleName="APA" Version="6"/>
+<?mso-contentType ?>
+<FormTemplates xmlns="http://schemas.microsoft.com/sharepoint/v3/contenttype/forms">
+  <Display>DocumentLibraryForm</Display>
+  <Edit>DocumentLibraryForm</Edit>
+  <New>DocumentLibraryForm</New>
+</FormTemplates>
 </file>
 
 <file path=customXml/item2.xml><?xml version="1.0" encoding="utf-8"?>
@@ -30870,12 +30761,7 @@
 </file>
 
 <file path=customXml/item3.xml><?xml version="1.0" encoding="utf-8"?>
-<?mso-contentType ?>
-<FormTemplates xmlns="http://schemas.microsoft.com/sharepoint/v3/contenttype/forms">
-  <Display>DocumentLibraryForm</Display>
-  <Edit>DocumentLibraryForm</Edit>
-  <New>DocumentLibraryForm</New>
-</FormTemplates>
+<b:Sources xmlns:b="http://schemas.openxmlformats.org/officeDocument/2006/bibliography" xmlns="http://schemas.openxmlformats.org/officeDocument/2006/bibliography" SelectedStyle="\APASixthEditionOfficeOnline.xsl" StyleName="APA" Version="6"/>
 </file>
 
 <file path=customXml/item4.xml><?xml version="1.0" encoding="utf-8"?>
@@ -30899,9 +30785,9 @@
 </file>
 
 <file path=customXml/itemProps1.xml><?xml version="1.0" encoding="utf-8"?>
-<ds:datastoreItem xmlns:ds="http://schemas.openxmlformats.org/officeDocument/2006/customXml" ds:itemID="{B690CEF4-07C7-4C0C-A6BB-7328017E8EDA}">
+<ds:datastoreItem xmlns:ds="http://schemas.openxmlformats.org/officeDocument/2006/customXml" ds:itemID="{AABE5AEB-BD32-46FB-B4E8-5C314C3FA503}">
   <ds:schemaRefs>
-    <ds:schemaRef ds:uri="http://schemas.openxmlformats.org/officeDocument/2006/bibliography"/>
+    <ds:schemaRef ds:uri="http://schemas.microsoft.com/sharepoint/v3/contenttype/forms"/>
   </ds:schemaRefs>
 </ds:datastoreItem>
 </file>
@@ -30928,9 +30814,9 @@
 </file>
 
 <file path=customXml/itemProps3.xml><?xml version="1.0" encoding="utf-8"?>
-<ds:datastoreItem xmlns:ds="http://schemas.openxmlformats.org/officeDocument/2006/customXml" ds:itemID="{AABE5AEB-BD32-46FB-B4E8-5C314C3FA503}">
+<ds:datastoreItem xmlns:ds="http://schemas.openxmlformats.org/officeDocument/2006/customXml" ds:itemID="{B690CEF4-07C7-4C0C-A6BB-7328017E8EDA}">
   <ds:schemaRefs>
-    <ds:schemaRef ds:uri="http://schemas.microsoft.com/sharepoint/v3/contenttype/forms"/>
+    <ds:schemaRef ds:uri="http://schemas.openxmlformats.org/officeDocument/2006/bibliography"/>
   </ds:schemaRefs>
 </ds:datastoreItem>
 </file>

</xml_diff>

<commit_message>
Update resume content for clarity and consistency, enhancing key skills and professional experience sections
</commit_message>
<xml_diff>
--- a/public/Resume Mayank Kantharia.docx
+++ b/public/Resume Mayank Kantharia.docx
@@ -406,7 +406,19 @@
         <w:rPr>
           <w:rFonts w:ascii="Lato" w:hAnsi="Lato" w:cs="Times New Roman"/>
         </w:rPr>
-        <w:t xml:space="preserve"> Supervised/unsupervised ML, NLP, LDA, sentiment analysis, embeddings, RAG pipelines, ranking models, model evaluation, statistical analysis, feature engineering, cross-validation</w:t>
+        <w:t xml:space="preserve"> Supervised/unsupervised ML, NLP</w:t>
+      </w:r>
+      <w:r>
+        <w:rPr>
+          <w:rFonts w:ascii="Lato" w:hAnsi="Lato" w:cs="Times New Roman"/>
+        </w:rPr>
+        <w:t xml:space="preserve">, </w:t>
+      </w:r>
+      <w:r>
+        <w:rPr>
+          <w:rFonts w:ascii="Lato" w:hAnsi="Lato" w:cs="Times New Roman"/>
+        </w:rPr>
+        <w:t>sentiment analysis, embeddings, RAG pipelines, model evaluation, statistical analysis, feature engineering, cross-validation</w:t>
       </w:r>
     </w:p>
     <w:p>
@@ -429,7 +441,19 @@
         <w:rPr>
           <w:rFonts w:ascii="Lato" w:hAnsi="Lato" w:cs="Times New Roman"/>
         </w:rPr>
-        <w:t xml:space="preserve"> Python, R, FastAPI, Flask, Django, SQL, TypeScript (Next.js components)</w:t>
+        <w:t xml:space="preserve"> </w:t>
+      </w:r>
+      <w:r>
+        <w:rPr>
+          <w:rFonts w:ascii="Lato" w:hAnsi="Lato" w:cs="Times New Roman"/>
+        </w:rPr>
+        <w:t xml:space="preserve">DSA, </w:t>
+      </w:r>
+      <w:r>
+        <w:rPr>
+          <w:rFonts w:ascii="Lato" w:hAnsi="Lato" w:cs="Times New Roman"/>
+        </w:rPr>
+        <w:t>Python, R, Flask, SQL, TypeScript (Next.js components)</w:t>
       </w:r>
     </w:p>
     <w:p>
@@ -452,7 +476,7 @@
         <w:rPr>
           <w:rFonts w:ascii="Lato" w:hAnsi="Lato" w:cs="Times New Roman"/>
         </w:rPr>
-        <w:t xml:space="preserve"> OpenAI API (GPT-4o embeddings), vector search (pgvector), semantic re-ranking, skill-gap analysis, AI agent workflows</w:t>
+        <w:t xml:space="preserve"> OpenAI API (GPT-4o embeddings), vector search (pgvector), semantic re-ranking</w:t>
       </w:r>
     </w:p>
     <w:p>
@@ -475,30 +499,55 @@
         <w:rPr>
           <w:rFonts w:ascii="Lato" w:hAnsi="Lato" w:cs="Times New Roman"/>
         </w:rPr>
-        <w:t xml:space="preserve"> AWS (EC2, S3, DynamoDB, Lambda, API Gateway), REST API design &amp; development, Supabase, Google Calendar API, Outlook Calendar API</w:t>
-      </w:r>
-    </w:p>
-    <w:p>
-      <w:pPr>
-        <w:spacing w:after="80"/>
-        <w:jc w:val="both"/>
-        <w:rPr>
-          <w:rFonts w:ascii="Lato" w:hAnsi="Lato" w:cs="Times New Roman"/>
-        </w:rPr>
-      </w:pPr>
-      <w:r>
-        <w:rPr>
-          <w:rFonts w:ascii="Lato" w:hAnsi="Lato" w:cs="Times New Roman"/>
-          <w:b/>
-          <w:bCs/>
-        </w:rPr>
-        <w:t>DevOps &amp; Engineering Practices:</w:t>
+        <w:t xml:space="preserve"> AWS </w:t>
       </w:r>
       <w:r>
         <w:rPr>
           <w:rFonts w:ascii="Lato" w:hAnsi="Lato" w:cs="Times New Roman"/>
         </w:rPr>
-        <w:t xml:space="preserve"> Docker, Git, GitHub, Agile/Scrum, CI/CD basics, logging &amp; monitoring</w:t>
+        <w:t xml:space="preserve">Basics, </w:t>
+      </w:r>
+      <w:r>
+        <w:rPr>
+          <w:rFonts w:ascii="Lato" w:hAnsi="Lato" w:cs="Times New Roman"/>
+        </w:rPr>
+        <w:t>REST AP</w:t>
+      </w:r>
+      <w:r>
+        <w:rPr>
+          <w:rFonts w:ascii="Lato" w:hAnsi="Lato" w:cs="Times New Roman"/>
+        </w:rPr>
+        <w:t>I</w:t>
+      </w:r>
+      <w:r>
+        <w:rPr>
+          <w:rFonts w:ascii="Lato" w:hAnsi="Lato" w:cs="Times New Roman"/>
+        </w:rPr>
+        <w:t>,</w:t>
+      </w:r>
+      <w:r>
+        <w:rPr>
+          <w:rFonts w:ascii="Lato" w:hAnsi="Lato" w:cs="Times New Roman"/>
+        </w:rPr>
+        <w:t xml:space="preserve"> </w:t>
+      </w:r>
+      <w:r>
+        <w:rPr>
+          <w:rFonts w:ascii="Lato" w:hAnsi="Lato" w:cs="Times New Roman"/>
+        </w:rPr>
+        <w:t>FastAPI</w:t>
+      </w:r>
+      <w:r>
+        <w:rPr>
+          <w:rFonts w:ascii="Lato" w:hAnsi="Lato" w:cs="Times New Roman"/>
+        </w:rPr>
+        <w:t>,</w:t>
+      </w:r>
+      <w:r>
+        <w:rPr>
+          <w:rFonts w:ascii="Lato" w:hAnsi="Lato" w:cs="Times New Roman"/>
+        </w:rPr>
+        <w:t xml:space="preserve"> Supabase</w:t>
       </w:r>
     </w:p>
     <w:p>
@@ -521,7 +570,43 @@
         <w:rPr>
           <w:rFonts w:ascii="Lato" w:hAnsi="Lato" w:cs="Times New Roman"/>
         </w:rPr>
-        <w:t xml:space="preserve"> MySQL, MongoDB, PostgreSQL, pgvector</w:t>
+        <w:t xml:space="preserve"> SQL</w:t>
+      </w:r>
+      <w:r>
+        <w:rPr>
+          <w:rFonts w:ascii="Lato" w:hAnsi="Lato" w:cs="Times New Roman"/>
+        </w:rPr>
+        <w:t xml:space="preserve"> Workbench</w:t>
+      </w:r>
+      <w:r>
+        <w:rPr>
+          <w:rFonts w:ascii="Lato" w:hAnsi="Lato" w:cs="Times New Roman"/>
+        </w:rPr>
+        <w:t>, MongoDB, PostgreSQL, pgvector</w:t>
+      </w:r>
+      <w:r>
+        <w:rPr>
+          <w:rFonts w:ascii="Lato" w:hAnsi="Lato" w:cs="Times New Roman"/>
+        </w:rPr>
+        <w:t xml:space="preserve">, </w:t>
+      </w:r>
+      <w:r>
+        <w:rPr>
+          <w:rFonts w:ascii="Lato" w:hAnsi="Lato" w:cs="Times New Roman"/>
+        </w:rPr>
+        <w:t>Git</w:t>
+      </w:r>
+      <w:r>
+        <w:rPr>
+          <w:rFonts w:ascii="Lato" w:hAnsi="Lato" w:cs="Times New Roman"/>
+        </w:rPr>
+        <w:t>/</w:t>
+      </w:r>
+      <w:r>
+        <w:rPr>
+          <w:rFonts w:ascii="Lato" w:hAnsi="Lato" w:cs="Times New Roman"/>
+        </w:rPr>
+        <w:t>GitHub</w:t>
       </w:r>
     </w:p>
     <w:p>
@@ -538,13 +623,35 @@
           <w:b/>
           <w:bCs/>
         </w:rPr>
-        <w:t>Visualisation &amp; BI:</w:t>
+        <w:t>Visualisatio</w:t>
+      </w:r>
+      <w:r>
+        <w:rPr>
+          <w:rFonts w:ascii="Lato" w:hAnsi="Lato" w:cs="Times New Roman"/>
+          <w:b/>
+          <w:bCs/>
+        </w:rPr>
+        <w:t>n</w:t>
+      </w:r>
+      <w:r>
+        <w:rPr>
+          <w:rFonts w:ascii="Lato" w:hAnsi="Lato" w:cs="Times New Roman"/>
+          <w:b/>
+          <w:bCs/>
+        </w:rPr>
+        <w:t>:</w:t>
       </w:r>
       <w:r>
         <w:rPr>
           <w:rFonts w:ascii="Lato" w:hAnsi="Lato" w:cs="Times New Roman"/>
         </w:rPr>
-        <w:t xml:space="preserve"> Tableau, Power BI, Matplotlib, Seaborn</w:t>
+        <w:t xml:space="preserve"> Power BI, Matplotlib, Seaborn</w:t>
+      </w:r>
+      <w:r>
+        <w:rPr>
+          <w:rFonts w:ascii="Lato" w:hAnsi="Lato" w:cs="Times New Roman"/>
+        </w:rPr>
+        <w:t>, Shinny</w:t>
       </w:r>
     </w:p>
     <w:p>
@@ -566,7 +673,7 @@
         <w:rPr>
           <w:rFonts w:ascii="Lato" w:hAnsi="Lato" w:cs="Times New Roman"/>
         </w:rPr>
-        <w:t xml:space="preserve"> Detail-oriented, analytical thinker, clear communicator, adaptable collaborator, well-organised</w:t>
+        <w:t xml:space="preserve"> Detail-oriented, analytical thinker, clear communicator, adaptable collaborator</w:t>
       </w:r>
     </w:p>
     <w:p>
@@ -581,7 +688,7 @@
         <w:rPr>
           <w:rFonts w:ascii="Lato" w:hAnsi="Lato" w:cs="Times New Roman"/>
         </w:rPr>
-        <w:t>Internships</w:t>
+        <w:t>Professional Experience</w:t>
       </w:r>
     </w:p>
     <w:p>
@@ -685,7 +792,7 @@
           <w:bCs/>
           <w:color w:val="000000" w:themeColor="text1"/>
         </w:rPr>
-        <w:t xml:space="preserve">Path | Data Scientist Intern | </w:t>
+        <w:t xml:space="preserve">Path | Data Scientist | </w:t>
       </w:r>
       <w:r>
         <w:rPr>
@@ -813,7 +920,19 @@
         <w:rPr>
           <w:rFonts w:ascii="Lato" w:hAnsi="Lato" w:cs="Times New Roman"/>
         </w:rPr>
-        <w:t>Integrated Google and Outlook Calendar APIs and contributed to Next.js and TypeScript components for roadmap visualization while collaborating in a 5-member Agile team</w:t>
+        <w:t xml:space="preserve">Integrated Google and Outlook Calendar APIs and contributed to Next.js and TypeScript components for roadmap visualization while collaborating in </w:t>
+      </w:r>
+      <w:r>
+        <w:rPr>
+          <w:rFonts w:ascii="Lato" w:hAnsi="Lato" w:cs="Times New Roman"/>
+        </w:rPr>
+        <w:t>an</w:t>
+      </w:r>
+      <w:r>
+        <w:rPr>
+          <w:rFonts w:ascii="Lato" w:hAnsi="Lato" w:cs="Times New Roman"/>
+        </w:rPr>
+        <w:t xml:space="preserve"> Agile team</w:t>
       </w:r>
     </w:p>
     <w:p>
@@ -1266,7 +1385,6 @@
         <w:rPr>
           <w:rFonts w:ascii="Lato" w:hAnsi="Lato" w:cs="Times New Roman"/>
         </w:rPr>
-        <w:lastRenderedPageBreak/>
         <w:t>Collected and processed 90,000 comments from Reddit and YouTube, performing large-scale cleaning and preprocessing</w:t>
       </w:r>
     </w:p>
@@ -1307,6 +1425,7 @@
         <w:rPr>
           <w:rFonts w:ascii="Lato" w:hAnsi="Lato" w:cs="Times New Roman"/>
         </w:rPr>
+        <w:lastRenderedPageBreak/>
         <w:t>Constructed interaction graphs, applied Louvain community detection, and simulated information diffusion using the Independent Cascade model</w:t>
       </w:r>
     </w:p>
@@ -1552,7 +1671,13 @@
         <w:rPr>
           <w:rFonts w:ascii="Lato" w:hAnsi="Lato" w:cs="Times New Roman"/>
         </w:rPr>
-        <w:t xml:space="preserve"> using 5</w:t>
+        <w:t xml:space="preserve"> using </w:t>
+      </w:r>
+      <w:r>
+        <w:rPr>
+          <w:rFonts w:ascii="Lato" w:hAnsi="Lato" w:cs="Times New Roman"/>
+        </w:rPr>
+        <w:t>n</w:t>
       </w:r>
       <w:r>
         <w:rPr>
@@ -29672,6 +29797,7 @@
     <w:rsid w:val="004E3344"/>
     <w:rsid w:val="005073E3"/>
     <w:rsid w:val="005377CD"/>
+    <w:rsid w:val="00597329"/>
     <w:rsid w:val="005F4681"/>
     <w:rsid w:val="00626C2D"/>
     <w:rsid w:val="006D1D96"/>
@@ -29705,6 +29831,7 @@
     <w:rsid w:val="00EB38A9"/>
     <w:rsid w:val="00EB5184"/>
     <w:rsid w:val="00F02B06"/>
+    <w:rsid w:val="00F27418"/>
     <w:rsid w:val="00FB3C96"/>
   </w:rsids>
   <m:mathPr>
@@ -30452,15 +30579,6 @@
 </file>
 
 <file path=customXml/item1.xml><?xml version="1.0" encoding="utf-8"?>
-<?mso-contentType ?>
-<FormTemplates xmlns="http://schemas.microsoft.com/sharepoint/v3/contenttype/forms">
-  <Display>DocumentLibraryForm</Display>
-  <Edit>DocumentLibraryForm</Edit>
-  <New>DocumentLibraryForm</New>
-</FormTemplates>
-</file>
-
-<file path=customXml/item2.xml><?xml version="1.0" encoding="utf-8"?>
 <ct:contentTypeSchema xmlns:ct="http://schemas.microsoft.com/office/2006/metadata/contentType" xmlns:ma="http://schemas.microsoft.com/office/2006/metadata/properties/metaAttributes" ct:_="" ma:_="" ma:contentTypeName="Document" ma:contentTypeID="0x01010079F111ED35F8CC479449609E8A0923A6" ma:contentTypeVersion="26" ma:contentTypeDescription="Create a new document." ma:contentTypeScope="" ma:versionID="ac37c1753acd5e330d2062ccec26ea66">
   <xsd:schema xmlns:xsd="http://www.w3.org/2001/XMLSchema" xmlns:xs="http://www.w3.org/2001/XMLSchema" xmlns:p="http://schemas.microsoft.com/office/2006/metadata/properties" xmlns:ns1="http://schemas.microsoft.com/sharepoint/v3" xmlns:ns2="71af3243-3dd4-4a8d-8c0d-dd76da1f02a5" xmlns:ns3="16c05727-aa75-4e4a-9b5f-8a80a1165891" xmlns:ns4="230e9df3-be65-4c73-a93b-d1236ebd677e" targetNamespace="http://schemas.microsoft.com/office/2006/metadata/properties" ma:root="true" ma:fieldsID="3b340c7101c92c5120abd06486f94548" ns1:_="" ns2:_="" ns3:_="" ns4:_="">
     <xsd:import namespace="http://schemas.microsoft.com/sharepoint/v3"/>
@@ -30760,11 +30878,16 @@
 </ct:contentTypeSchema>
 </file>
 
-<file path=customXml/item3.xml><?xml version="1.0" encoding="utf-8"?>
-<b:Sources xmlns:b="http://schemas.openxmlformats.org/officeDocument/2006/bibliography" xmlns="http://schemas.openxmlformats.org/officeDocument/2006/bibliography" SelectedStyle="\APASixthEditionOfficeOnline.xsl" StyleName="APA" Version="6"/>
+<file path=customXml/item2.xml><?xml version="1.0" encoding="utf-8"?>
+<?mso-contentType ?>
+<FormTemplates xmlns="http://schemas.microsoft.com/sharepoint/v3/contenttype/forms">
+  <Display>DocumentLibraryForm</Display>
+  <Edit>DocumentLibraryForm</Edit>
+  <New>DocumentLibraryForm</New>
+</FormTemplates>
 </file>
 
-<file path=customXml/item4.xml><?xml version="1.0" encoding="utf-8"?>
+<file path=customXml/item3.xml><?xml version="1.0" encoding="utf-8"?>
 <p:properties xmlns:p="http://schemas.microsoft.com/office/2006/metadata/properties" xmlns:xsi="http://www.w3.org/2001/XMLSchema-instance" xmlns:pc="http://schemas.microsoft.com/office/infopath/2007/PartnerControls">
   <documentManagement>
     <_ip_UnifiedCompliancePolicyUIAction xmlns="http://schemas.microsoft.com/sharepoint/v3" xsi:nil="true"/>
@@ -30784,15 +30907,11 @@
 </p:properties>
 </file>
 
-<file path=customXml/itemProps1.xml><?xml version="1.0" encoding="utf-8"?>
-<ds:datastoreItem xmlns:ds="http://schemas.openxmlformats.org/officeDocument/2006/customXml" ds:itemID="{AABE5AEB-BD32-46FB-B4E8-5C314C3FA503}">
-  <ds:schemaRefs>
-    <ds:schemaRef ds:uri="http://schemas.microsoft.com/sharepoint/v3/contenttype/forms"/>
-  </ds:schemaRefs>
-</ds:datastoreItem>
+<file path=customXml/item4.xml><?xml version="1.0" encoding="utf-8"?>
+<b:Sources xmlns:b="http://schemas.openxmlformats.org/officeDocument/2006/bibliography" xmlns="http://schemas.openxmlformats.org/officeDocument/2006/bibliography" SelectedStyle="\APASixthEditionOfficeOnline.xsl" StyleName="APA" Version="6"/>
 </file>
 
-<file path=customXml/itemProps2.xml><?xml version="1.0" encoding="utf-8"?>
+<file path=customXml/itemProps1.xml><?xml version="1.0" encoding="utf-8"?>
 <ds:datastoreItem xmlns:ds="http://schemas.openxmlformats.org/officeDocument/2006/customXml" ds:itemID="{46268ACC-32FC-4261-BF80-5F6DE34E1C11}">
   <ds:schemaRefs>
     <ds:schemaRef ds:uri="http://schemas.microsoft.com/office/2006/metadata/contentType"/>
@@ -30813,15 +30932,15 @@
 </ds:datastoreItem>
 </file>
 
-<file path=customXml/itemProps3.xml><?xml version="1.0" encoding="utf-8"?>
-<ds:datastoreItem xmlns:ds="http://schemas.openxmlformats.org/officeDocument/2006/customXml" ds:itemID="{B690CEF4-07C7-4C0C-A6BB-7328017E8EDA}">
+<file path=customXml/itemProps2.xml><?xml version="1.0" encoding="utf-8"?>
+<ds:datastoreItem xmlns:ds="http://schemas.openxmlformats.org/officeDocument/2006/customXml" ds:itemID="{AABE5AEB-BD32-46FB-B4E8-5C314C3FA503}">
   <ds:schemaRefs>
-    <ds:schemaRef ds:uri="http://schemas.openxmlformats.org/officeDocument/2006/bibliography"/>
+    <ds:schemaRef ds:uri="http://schemas.microsoft.com/sharepoint/v3/contenttype/forms"/>
   </ds:schemaRefs>
 </ds:datastoreItem>
 </file>
 
-<file path=customXml/itemProps4.xml><?xml version="1.0" encoding="utf-8"?>
+<file path=customXml/itemProps3.xml><?xml version="1.0" encoding="utf-8"?>
 <ds:datastoreItem xmlns:ds="http://schemas.openxmlformats.org/officeDocument/2006/customXml" ds:itemID="{A9893E80-0AB2-4C42-8D6E-F0C64251EDE9}">
   <ds:schemaRefs>
     <ds:schemaRef ds:uri="http://schemas.microsoft.com/office/2006/metadata/properties"/>
@@ -30833,6 +30952,14 @@
 </ds:datastoreItem>
 </file>
 
+<file path=customXml/itemProps4.xml><?xml version="1.0" encoding="utf-8"?>
+<ds:datastoreItem xmlns:ds="http://schemas.openxmlformats.org/officeDocument/2006/customXml" ds:itemID="{B690CEF4-07C7-4C0C-A6BB-7328017E8EDA}">
+  <ds:schemaRefs>
+    <ds:schemaRef ds:uri="http://schemas.openxmlformats.org/officeDocument/2006/bibliography"/>
+  </ds:schemaRefs>
+</ds:datastoreItem>
+</file>
+
 <file path=docMetadata/LabelInfo.xml><?xml version="1.0" encoding="utf-8"?>
 <clbl:labelList xmlns:clbl="http://schemas.microsoft.com/office/2020/mipLabelMetadata"/>
 </file>
</xml_diff>

<commit_message>
Refactor resume content for clarity and consistency, updating key skills and tools sections
</commit_message>
<xml_diff>
--- a/public/Resume Mayank Kantharia.docx
+++ b/public/Resume Mayank Kantharia.docx
@@ -476,7 +476,19 @@
         <w:rPr>
           <w:rFonts w:ascii="Lato" w:hAnsi="Lato" w:cs="Times New Roman"/>
         </w:rPr>
-        <w:t xml:space="preserve"> OpenAI API (GPT-4o embeddings), vector search (pgvector), semantic re-ranking</w:t>
+        <w:t xml:space="preserve"> OpenAI API (GPT-4o embeddings), vector search</w:t>
+      </w:r>
+      <w:r>
+        <w:rPr>
+          <w:rFonts w:ascii="Lato" w:hAnsi="Lato" w:cs="Times New Roman"/>
+        </w:rPr>
+        <w:t xml:space="preserve">, </w:t>
+      </w:r>
+      <w:r>
+        <w:rPr>
+          <w:rFonts w:ascii="Lato" w:hAnsi="Lato" w:cs="Times New Roman"/>
+        </w:rPr>
+        <w:t>semantic re-ranking</w:t>
       </w:r>
     </w:p>
     <w:p>
@@ -531,12 +543,14 @@
         </w:rPr>
         <w:t xml:space="preserve"> </w:t>
       </w:r>
+      <w:proofErr w:type="spellStart"/>
       <w:r>
         <w:rPr>
           <w:rFonts w:ascii="Lato" w:hAnsi="Lato" w:cs="Times New Roman"/>
         </w:rPr>
         <w:t>FastAPI</w:t>
       </w:r>
+      <w:proofErr w:type="spellEnd"/>
       <w:r>
         <w:rPr>
           <w:rFonts w:ascii="Lato" w:hAnsi="Lato" w:cs="Times New Roman"/>
@@ -547,8 +561,16 @@
         <w:rPr>
           <w:rFonts w:ascii="Lato" w:hAnsi="Lato" w:cs="Times New Roman"/>
         </w:rPr>
-        <w:t xml:space="preserve"> Supabase</w:t>
+        <w:t xml:space="preserve"> </w:t>
       </w:r>
+      <w:proofErr w:type="spellStart"/>
+      <w:r>
+        <w:rPr>
+          <w:rFonts w:ascii="Lato" w:hAnsi="Lato" w:cs="Times New Roman"/>
+        </w:rPr>
+        <w:t>Supabase</w:t>
+      </w:r>
+      <w:proofErr w:type="spellEnd"/>
     </w:p>
     <w:p>
       <w:pPr>
@@ -570,20 +592,16 @@
         <w:rPr>
           <w:rFonts w:ascii="Lato" w:hAnsi="Lato" w:cs="Times New Roman"/>
         </w:rPr>
-        <w:t xml:space="preserve"> SQL</w:t>
+        <w:t xml:space="preserve"> SQL, MongoDB, PostgreSQL, </w:t>
       </w:r>
+      <w:proofErr w:type="spellStart"/>
       <w:r>
         <w:rPr>
           <w:rFonts w:ascii="Lato" w:hAnsi="Lato" w:cs="Times New Roman"/>
         </w:rPr>
-        <w:t xml:space="preserve"> Workbench</w:t>
+        <w:t>pgvector</w:t>
       </w:r>
-      <w:r>
-        <w:rPr>
-          <w:rFonts w:ascii="Lato" w:hAnsi="Lato" w:cs="Times New Roman"/>
-        </w:rPr>
-        <w:t>, MongoDB, PostgreSQL, pgvector</w:t>
-      </w:r>
+      <w:proofErr w:type="spellEnd"/>
       <w:r>
         <w:rPr>
           <w:rFonts w:ascii="Lato" w:hAnsi="Lato" w:cs="Times New Roman"/>
@@ -617,6 +635,7 @@
           <w:rFonts w:ascii="Lato" w:hAnsi="Lato" w:cs="Times New Roman"/>
         </w:rPr>
       </w:pPr>
+      <w:proofErr w:type="spellStart"/>
       <w:r>
         <w:rPr>
           <w:rFonts w:ascii="Lato" w:hAnsi="Lato" w:cs="Times New Roman"/>
@@ -633,6 +652,7 @@
         </w:rPr>
         <w:t>n</w:t>
       </w:r>
+      <w:proofErr w:type="spellEnd"/>
       <w:r>
         <w:rPr>
           <w:rFonts w:ascii="Lato" w:hAnsi="Lato" w:cs="Times New Roman"/>
@@ -646,12 +666,6 @@
           <w:rFonts w:ascii="Lato" w:hAnsi="Lato" w:cs="Times New Roman"/>
         </w:rPr>
         <w:t xml:space="preserve"> Power BI, Matplotlib, Seaborn</w:t>
-      </w:r>
-      <w:r>
-        <w:rPr>
-          <w:rFonts w:ascii="Lato" w:hAnsi="Lato" w:cs="Times New Roman"/>
-        </w:rPr>
-        <w:t>, Shinny</w:t>
       </w:r>
     </w:p>
     <w:p>
@@ -863,7 +877,35 @@
         <w:rPr>
           <w:rFonts w:ascii="Lato" w:hAnsi="Lato" w:cs="Times New Roman"/>
         </w:rPr>
-        <w:t>Built end-to-end RAG-based career guidance modules using GPT-4o embeddings and Supabase pgvector to generate personalized role recommendations and learning roadmaps</w:t>
+        <w:t xml:space="preserve">Built end-to-end RAG-based career guidance modules using GPT-4o embeddings and </w:t>
+      </w:r>
+      <w:proofErr w:type="spellStart"/>
+      <w:r>
+        <w:rPr>
+          <w:rFonts w:ascii="Lato" w:hAnsi="Lato" w:cs="Times New Roman"/>
+        </w:rPr>
+        <w:t>Supabase</w:t>
+      </w:r>
+      <w:proofErr w:type="spellEnd"/>
+      <w:r>
+        <w:rPr>
+          <w:rFonts w:ascii="Lato" w:hAnsi="Lato" w:cs="Times New Roman"/>
+        </w:rPr>
+        <w:t xml:space="preserve"> </w:t>
+      </w:r>
+      <w:proofErr w:type="spellStart"/>
+      <w:r>
+        <w:rPr>
+          <w:rFonts w:ascii="Lato" w:hAnsi="Lato" w:cs="Times New Roman"/>
+        </w:rPr>
+        <w:t>pgvector</w:t>
+      </w:r>
+      <w:proofErr w:type="spellEnd"/>
+      <w:r>
+        <w:rPr>
+          <w:rFonts w:ascii="Lato" w:hAnsi="Lato" w:cs="Times New Roman"/>
+        </w:rPr>
+        <w:t xml:space="preserve"> to generate personalized role recommendations and learning roadmaps</w:t>
       </w:r>
     </w:p>
     <w:p>
@@ -882,7 +924,21 @@
         <w:rPr>
           <w:rFonts w:ascii="Lato" w:hAnsi="Lato" w:cs="Times New Roman"/>
         </w:rPr>
-        <w:t>Developed FastAPI ML services for retrieval, semantic re-ranking, enrichment-pack generation, and skill-gap analysis, achieving 3 second end-to-end latency and 5 millisecond vector searches</w:t>
+        <w:t xml:space="preserve">Developed </w:t>
+      </w:r>
+      <w:proofErr w:type="spellStart"/>
+      <w:r>
+        <w:rPr>
+          <w:rFonts w:ascii="Lato" w:hAnsi="Lato" w:cs="Times New Roman"/>
+        </w:rPr>
+        <w:t>FastAPI</w:t>
+      </w:r>
+      <w:proofErr w:type="spellEnd"/>
+      <w:r>
+        <w:rPr>
+          <w:rFonts w:ascii="Lato" w:hAnsi="Lato" w:cs="Times New Roman"/>
+        </w:rPr>
+        <w:t xml:space="preserve"> ML services for retrieval, semantic re-ranking, enrichment-pack generation, and skill-gap analysis, achieving 3 second end-to-end latency and 5 millisecond vector searches</w:t>
       </w:r>
     </w:p>
     <w:p>
@@ -1365,7 +1421,25 @@
           <w:i/>
           <w:iCs/>
         </w:rPr>
-        <w:t>Python, PRAW, YouTube API, NLP, LDA, VADER, NetworkX, Louvain</w:t>
+        <w:t xml:space="preserve">Python, PRAW, YouTube API, NLP, LDA, VADER, </w:t>
+      </w:r>
+      <w:proofErr w:type="spellStart"/>
+      <w:r>
+        <w:rPr>
+          <w:rFonts w:ascii="Lato" w:hAnsi="Lato" w:cs="Times New Roman"/>
+          <w:i/>
+          <w:iCs/>
+        </w:rPr>
+        <w:t>NetworkX</w:t>
+      </w:r>
+      <w:proofErr w:type="spellEnd"/>
+      <w:r>
+        <w:rPr>
+          <w:rFonts w:ascii="Lato" w:hAnsi="Lato" w:cs="Times New Roman"/>
+          <w:i/>
+          <w:iCs/>
+        </w:rPr>
+        <w:t>, Louvain</w:t>
       </w:r>
     </w:p>
     <w:p>
@@ -1485,7 +1559,25 @@
           <w:i/>
           <w:iCs/>
         </w:rPr>
-        <w:t>TensorFlow, FastText, TF</w:t>
+        <w:t xml:space="preserve">TensorFlow, </w:t>
+      </w:r>
+      <w:proofErr w:type="spellStart"/>
+      <w:r>
+        <w:rPr>
+          <w:rFonts w:ascii="Lato" w:hAnsi="Lato" w:cs="Times New Roman"/>
+          <w:i/>
+          <w:iCs/>
+        </w:rPr>
+        <w:t>FastText</w:t>
+      </w:r>
+      <w:proofErr w:type="spellEnd"/>
+      <w:r>
+        <w:rPr>
+          <w:rFonts w:ascii="Lato" w:hAnsi="Lato" w:cs="Times New Roman"/>
+          <w:i/>
+          <w:iCs/>
+        </w:rPr>
+        <w:t>, TF</w:t>
       </w:r>
       <w:r>
         <w:rPr>
@@ -1558,7 +1650,21 @@
         <w:rPr>
           <w:rFonts w:ascii="Lato" w:hAnsi="Lato" w:cs="Times New Roman"/>
         </w:rPr>
-        <w:t>Implemented preprocessing: regex tokenization, stopword removal, rare</w:t>
+        <w:t xml:space="preserve">Implemented preprocessing: regex tokenization, </w:t>
+      </w:r>
+      <w:proofErr w:type="spellStart"/>
+      <w:r>
+        <w:rPr>
+          <w:rFonts w:ascii="Lato" w:hAnsi="Lato" w:cs="Times New Roman"/>
+        </w:rPr>
+        <w:t>stopword</w:t>
+      </w:r>
+      <w:proofErr w:type="spellEnd"/>
+      <w:r>
+        <w:rPr>
+          <w:rFonts w:ascii="Lato" w:hAnsi="Lato" w:cs="Times New Roman"/>
+        </w:rPr>
+        <w:t xml:space="preserve"> removal, rare</w:t>
       </w:r>
       <w:r>
         <w:rPr>
@@ -1835,13 +1941,23 @@
           <w:iCs/>
         </w:rPr>
       </w:pPr>
+      <w:proofErr w:type="spellStart"/>
       <w:r>
         <w:rPr>
           <w:rFonts w:ascii="Lato" w:hAnsi="Lato" w:cs="Times New Roman"/>
           <w:i/>
           <w:iCs/>
         </w:rPr>
-        <w:t>PyTorch, TensorFlow, Deep Learning, Attention Mechanisms</w:t>
+        <w:t>PyTorch</w:t>
+      </w:r>
+      <w:proofErr w:type="spellEnd"/>
+      <w:r>
+        <w:rPr>
+          <w:rFonts w:ascii="Lato" w:hAnsi="Lato" w:cs="Times New Roman"/>
+          <w:i/>
+          <w:iCs/>
+        </w:rPr>
+        <w:t>, TensorFlow, Deep Learning, Attention Mechanisms</w:t>
       </w:r>
     </w:p>
     <w:bookmarkEnd w:id="1"/>
@@ -29790,6 +29906,7 @@
     <w:rsid w:val="002E0C39"/>
     <w:rsid w:val="002E4C8F"/>
     <w:rsid w:val="00342027"/>
+    <w:rsid w:val="00426A38"/>
     <w:rsid w:val="0043450B"/>
     <w:rsid w:val="00444BA4"/>
     <w:rsid w:val="00476DF0"/>
@@ -29802,6 +29919,7 @@
     <w:rsid w:val="00626C2D"/>
     <w:rsid w:val="006D1D96"/>
     <w:rsid w:val="006D1E7F"/>
+    <w:rsid w:val="00724F98"/>
     <w:rsid w:val="007424F3"/>
     <w:rsid w:val="0074445F"/>
     <w:rsid w:val="00752673"/>
@@ -29826,12 +29944,14 @@
     <w:rsid w:val="00D15F45"/>
     <w:rsid w:val="00D172AB"/>
     <w:rsid w:val="00D76F55"/>
+    <w:rsid w:val="00DF2088"/>
     <w:rsid w:val="00E26E6D"/>
     <w:rsid w:val="00EA60EF"/>
     <w:rsid w:val="00EB38A9"/>
     <w:rsid w:val="00EB5184"/>
     <w:rsid w:val="00F02B06"/>
     <w:rsid w:val="00F27418"/>
+    <w:rsid w:val="00FB203F"/>
     <w:rsid w:val="00FB3C96"/>
   </w:rsids>
   <m:mathPr>

</xml_diff>

<commit_message>
Update resume content for clarity and consistency, enhancing key skills, professional experience, and project descriptions
</commit_message>
<xml_diff>
--- a/public/Resume Mayank Kantharia.docx
+++ b/public/Resume Mayank Kantharia.docx
@@ -32,25 +32,19 @@
         <w:rPr>
           <w:rFonts w:ascii="Lato" w:hAnsi="Lato" w:cs="Times New Roman"/>
         </w:rPr>
-        <w:t>Melbourne</w:t>
+        <w:t xml:space="preserve">Melbourne </w:t>
       </w:r>
       <w:r>
         <w:rPr>
           <w:rFonts w:ascii="Lato" w:hAnsi="Lato" w:cs="Times New Roman"/>
         </w:rPr>
-        <w:t xml:space="preserve">  </w:t>
+        <w:t>| +</w:t>
       </w:r>
       <w:r>
         <w:rPr>
           <w:rFonts w:ascii="Lato" w:hAnsi="Lato" w:cs="Times New Roman"/>
         </w:rPr>
-        <w:t xml:space="preserve">| </w:t>
-      </w:r>
-      <w:r>
-        <w:rPr>
-          <w:rFonts w:ascii="Lato" w:hAnsi="Lato" w:cs="Times New Roman"/>
-        </w:rPr>
-        <w:t>+61</w:t>
+        <w:t>61</w:t>
       </w:r>
       <w:r>
         <w:rPr>
@@ -62,19 +56,13 @@
         <w:rPr>
           <w:rFonts w:ascii="Lato" w:hAnsi="Lato" w:cs="Times New Roman"/>
         </w:rPr>
-        <w:t>0411683252</w:t>
+        <w:t xml:space="preserve">411683252 </w:t>
       </w:r>
       <w:r>
         <w:rPr>
           <w:rFonts w:ascii="Lato" w:hAnsi="Lato" w:cs="Times New Roman"/>
         </w:rPr>
-        <w:t xml:space="preserve"> </w:t>
-      </w:r>
-      <w:r>
-        <w:rPr>
-          <w:rFonts w:ascii="Lato" w:hAnsi="Lato" w:cs="Times New Roman"/>
-        </w:rPr>
-        <w:t xml:space="preserve"> |</w:t>
+        <w:t>|</w:t>
       </w:r>
       <w:r>
         <w:rPr>
@@ -94,7 +82,6 @@
             <w:rStyle w:val="Hyperlink"/>
             <w:rFonts w:ascii="Lato" w:hAnsi="Lato" w:cs="Times New Roman"/>
             <w:color w:val="000000" w:themeColor="text1"/>
-            <w:u w:val="none"/>
           </w:rPr>
           <w:t>mayankkantharia01@gmail.com</w:t>
         </w:r>
@@ -135,7 +122,6 @@
             <w:rStyle w:val="Hyperlink"/>
             <w:rFonts w:ascii="Lato" w:hAnsi="Lato" w:cs="Times New Roman"/>
             <w:color w:val="000000" w:themeColor="text1"/>
-            <w:u w:val="none"/>
           </w:rPr>
           <w:t>GitHub</w:t>
         </w:r>
@@ -154,7 +140,24 @@
             <w:color w:val="000000" w:themeColor="text1"/>
             <w:u w:val="none"/>
           </w:rPr>
-          <w:t xml:space="preserve">  LinkedIn  </w:t>
+          <w:t xml:space="preserve">  </w:t>
+        </w:r>
+        <w:r>
+          <w:rPr>
+            <w:rStyle w:val="Hyperlink"/>
+            <w:rFonts w:ascii="Lato" w:hAnsi="Lato" w:cs="Times New Roman"/>
+            <w:color w:val="000000" w:themeColor="text1"/>
+          </w:rPr>
+          <w:t>LinkedIn</w:t>
+        </w:r>
+        <w:r>
+          <w:rPr>
+            <w:rStyle w:val="Hyperlink"/>
+            <w:rFonts w:ascii="Lato" w:hAnsi="Lato" w:cs="Times New Roman"/>
+            <w:color w:val="000000" w:themeColor="text1"/>
+            <w:u w:val="none"/>
+          </w:rPr>
+          <w:t xml:space="preserve">  </w:t>
         </w:r>
       </w:hyperlink>
       <w:r>
@@ -169,7 +172,6 @@
             <w:rStyle w:val="Hyperlink"/>
             <w:rFonts w:ascii="Lato" w:hAnsi="Lato" w:cs="Times New Roman"/>
             <w:color w:val="000000" w:themeColor="text1"/>
-            <w:u w:val="none"/>
           </w:rPr>
           <w:t>Portfolio</w:t>
         </w:r>
@@ -273,6 +275,7 @@
     </w:p>
     <w:p>
       <w:pPr>
+        <w:spacing w:before="40"/>
         <w:jc w:val="both"/>
         <w:rPr>
           <w:rFonts w:ascii="Lato" w:hAnsi="Lato" w:cs="Times New Roman"/>
@@ -282,7 +285,7 @@
         <w:rPr>
           <w:rFonts w:ascii="Lato" w:hAnsi="Lato" w:cs="Times New Roman"/>
         </w:rPr>
-        <w:t>Data Scientist with experience in machine learning, NLP, cloud-based systems, and end-to-end analytical solution development. Skilled at transforming complex datasets into actionable insights, building scalable ML services, and collaborating with stakeholders to deliver business-focused outcomes. Passionate about applying advanced analytics to solve real-world problems and support data-driven decision-making and operational improvements</w:t>
+        <w:t>Data Scientist with a background in machine learning, NLP, and cloud-based systems. Experienced in building end-to-end analytical pipelines, deploying ML models, and developing data-driven products that support measurable business outcomes</w:t>
       </w:r>
       <w:r>
         <w:rPr>
@@ -406,7 +409,27 @@
         <w:rPr>
           <w:rFonts w:ascii="Lato" w:hAnsi="Lato" w:cs="Times New Roman"/>
         </w:rPr>
-        <w:t xml:space="preserve"> Supervised/unsupervised ML, NLP</w:t>
+        <w:t xml:space="preserve"> </w:t>
+      </w:r>
+      <w:r>
+        <w:rPr>
+          <w:rFonts w:ascii="Lato" w:hAnsi="Lato" w:cs="Times New Roman"/>
+        </w:rPr>
+        <w:t xml:space="preserve">scikit-learn, </w:t>
+      </w:r>
+      <w:proofErr w:type="spellStart"/>
+      <w:r>
+        <w:rPr>
+          <w:rFonts w:ascii="Lato" w:hAnsi="Lato" w:cs="Times New Roman"/>
+        </w:rPr>
+        <w:t>PyTorch</w:t>
+      </w:r>
+      <w:proofErr w:type="spellEnd"/>
+      <w:r>
+        <w:rPr>
+          <w:rFonts w:ascii="Lato" w:hAnsi="Lato" w:cs="Times New Roman"/>
+        </w:rPr>
+        <w:t>, TensorFlow</w:t>
       </w:r>
       <w:r>
         <w:rPr>
@@ -418,7 +441,25 @@
         <w:rPr>
           <w:rFonts w:ascii="Lato" w:hAnsi="Lato" w:cs="Times New Roman"/>
         </w:rPr>
-        <w:t>sentiment analysis, embeddings, RAG pipelines, model evaluation, statistical analysis, feature engineering, cross-validation</w:t>
+        <w:t>Supervised/unsupervised ML, NLP</w:t>
+      </w:r>
+      <w:r>
+        <w:rPr>
+          <w:rFonts w:ascii="Lato" w:hAnsi="Lato" w:cs="Times New Roman"/>
+        </w:rPr>
+        <w:t xml:space="preserve">, </w:t>
+      </w:r>
+      <w:r>
+        <w:rPr>
+          <w:rFonts w:ascii="Lato" w:hAnsi="Lato" w:cs="Times New Roman"/>
+        </w:rPr>
+        <w:t>text classification</w:t>
+      </w:r>
+      <w:r>
+        <w:rPr>
+          <w:rFonts w:ascii="Lato" w:hAnsi="Lato" w:cs="Times New Roman"/>
+        </w:rPr>
+        <w:t>, embeddings, RAG pipelines, model evaluation, statistical analysis, feature engineering, cross-validation</w:t>
       </w:r>
     </w:p>
     <w:p>
@@ -441,19 +482,7 @@
         <w:rPr>
           <w:rFonts w:ascii="Lato" w:hAnsi="Lato" w:cs="Times New Roman"/>
         </w:rPr>
-        <w:t xml:space="preserve"> </w:t>
-      </w:r>
-      <w:r>
-        <w:rPr>
-          <w:rFonts w:ascii="Lato" w:hAnsi="Lato" w:cs="Times New Roman"/>
-        </w:rPr>
-        <w:t xml:space="preserve">DSA, </w:t>
-      </w:r>
-      <w:r>
-        <w:rPr>
-          <w:rFonts w:ascii="Lato" w:hAnsi="Lato" w:cs="Times New Roman"/>
-        </w:rPr>
-        <w:t>Python, R, Flask, SQL, TypeScript (Next.js components)</w:t>
+        <w:t xml:space="preserve"> Python, R, Flask, SQL, Next.js</w:t>
       </w:r>
     </w:p>
     <w:p>
@@ -505,19 +534,41 @@
           <w:b/>
           <w:bCs/>
         </w:rPr>
-        <w:t>Cloud, APIs &amp; Platforms:</w:t>
+        <w:t>Cloud</w:t>
+      </w:r>
+      <w:r>
+        <w:rPr>
+          <w:rFonts w:ascii="Lato" w:hAnsi="Lato" w:cs="Times New Roman"/>
+          <w:b/>
+          <w:bCs/>
+        </w:rPr>
+        <w:t xml:space="preserve"> &amp;</w:t>
+      </w:r>
+      <w:r>
+        <w:rPr>
+          <w:rFonts w:ascii="Lato" w:hAnsi="Lato" w:cs="Times New Roman"/>
+          <w:b/>
+          <w:bCs/>
+        </w:rPr>
+        <w:t xml:space="preserve"> Platforms:</w:t>
       </w:r>
       <w:r>
         <w:rPr>
           <w:rFonts w:ascii="Lato" w:hAnsi="Lato" w:cs="Times New Roman"/>
         </w:rPr>
-        <w:t xml:space="preserve"> AWS </w:t>
+        <w:t xml:space="preserve"> </w:t>
       </w:r>
       <w:r>
         <w:rPr>
           <w:rFonts w:ascii="Lato" w:hAnsi="Lato" w:cs="Times New Roman"/>
         </w:rPr>
-        <w:t xml:space="preserve">Basics, </w:t>
+        <w:t>AWS (EC2, S3, Lambda, DynamoDB, API Gateway)</w:t>
+      </w:r>
+      <w:r>
+        <w:rPr>
+          <w:rFonts w:ascii="Lato" w:hAnsi="Lato" w:cs="Times New Roman"/>
+        </w:rPr>
+        <w:t xml:space="preserve">, </w:t>
       </w:r>
       <w:r>
         <w:rPr>
@@ -633,6 +684,7 @@
         <w:jc w:val="both"/>
         <w:rPr>
           <w:rFonts w:ascii="Lato" w:hAnsi="Lato" w:cs="Times New Roman"/>
+          <w:lang w:val="en-AU"/>
         </w:rPr>
       </w:pPr>
       <w:proofErr w:type="spellStart"/>
@@ -667,27 +719,24 @@
         </w:rPr>
         <w:t xml:space="preserve"> Power BI, Matplotlib, Seaborn</w:t>
       </w:r>
-    </w:p>
-    <w:p>
-      <w:pPr>
-        <w:jc w:val="both"/>
+      <w:r>
         <w:rPr>
           <w:rFonts w:ascii="Lato" w:hAnsi="Lato" w:cs="Times New Roman"/>
         </w:rPr>
-      </w:pPr>
-      <w:r>
-        <w:rPr>
-          <w:rFonts w:ascii="Lato" w:hAnsi="Lato" w:cs="Times New Roman"/>
-          <w:b/>
-          <w:bCs/>
-        </w:rPr>
-        <w:t>Professional Strengths:</w:t>
+        <w:t>, Tableau</w:t>
       </w:r>
       <w:r>
         <w:rPr>
           <w:rFonts w:ascii="Lato" w:hAnsi="Lato" w:cs="Times New Roman"/>
         </w:rPr>
-        <w:t xml:space="preserve"> Detail-oriented, analytical thinker, clear communicator, adaptable collaborator</w:t>
+        <w:t xml:space="preserve">, </w:t>
+      </w:r>
+      <w:r>
+        <w:rPr>
+          <w:rFonts w:ascii="Lato" w:hAnsi="Lato" w:cs="Times New Roman"/>
+          <w:lang w:val="en-AU"/>
+        </w:rPr>
+        <w:t>ggplot2</w:t>
       </w:r>
     </w:p>
     <w:p>
@@ -806,7 +855,7 @@
           <w:bCs/>
           <w:color w:val="000000" w:themeColor="text1"/>
         </w:rPr>
-        <w:t xml:space="preserve">Path | Data Scientist | </w:t>
+        <w:t>Path | Data Scientist</w:t>
       </w:r>
       <w:r>
         <w:rPr>
@@ -814,7 +863,7 @@
           <w:bCs/>
           <w:color w:val="000000" w:themeColor="text1"/>
         </w:rPr>
-        <w:t>Internship</w:t>
+        <w:t xml:space="preserve"> Intern</w:t>
       </w:r>
       <w:r>
         <w:rPr>
@@ -855,7 +904,21 @@
               <w:rFonts w:ascii="Lato" w:hAnsi="Lato" w:cs="Times New Roman"/>
               <w:color w:val="000000" w:themeColor="text1"/>
             </w:rPr>
-            <w:t xml:space="preserve"> Nov 2025</w:t>
+            <w:t xml:space="preserve"> Nov</w:t>
+          </w:r>
+          <w:r>
+            <w:rPr>
+              <w:rFonts w:ascii="Lato" w:hAnsi="Lato" w:cs="Times New Roman"/>
+              <w:color w:val="000000" w:themeColor="text1"/>
+            </w:rPr>
+            <w:t>ember</w:t>
+          </w:r>
+          <w:r>
+            <w:rPr>
+              <w:rFonts w:ascii="Lato" w:hAnsi="Lato" w:cs="Times New Roman"/>
+              <w:color w:val="000000" w:themeColor="text1"/>
+            </w:rPr>
+            <w:t xml:space="preserve"> 2025</w:t>
           </w:r>
         </w:sdtContent>
       </w:sdt>
@@ -877,35 +940,21 @@
         <w:rPr>
           <w:rFonts w:ascii="Lato" w:hAnsi="Lato" w:cs="Times New Roman"/>
         </w:rPr>
-        <w:t xml:space="preserve">Built end-to-end RAG-based career guidance modules using GPT-4o embeddings and </w:t>
+        <w:t xml:space="preserve">Architected end-to-end RAG pipelines for </w:t>
       </w:r>
       <w:proofErr w:type="spellStart"/>
       <w:r>
         <w:rPr>
           <w:rFonts w:ascii="Lato" w:hAnsi="Lato" w:cs="Times New Roman"/>
         </w:rPr>
-        <w:t>Supabase</w:t>
+        <w:t>personalised</w:t>
       </w:r>
       <w:proofErr w:type="spellEnd"/>
       <w:r>
         <w:rPr>
           <w:rFonts w:ascii="Lato" w:hAnsi="Lato" w:cs="Times New Roman"/>
         </w:rPr>
-        <w:t xml:space="preserve"> </w:t>
-      </w:r>
-      <w:proofErr w:type="spellStart"/>
-      <w:r>
-        <w:rPr>
-          <w:rFonts w:ascii="Lato" w:hAnsi="Lato" w:cs="Times New Roman"/>
-        </w:rPr>
-        <w:t>pgvector</w:t>
-      </w:r>
-      <w:proofErr w:type="spellEnd"/>
-      <w:r>
-        <w:rPr>
-          <w:rFonts w:ascii="Lato" w:hAnsi="Lato" w:cs="Times New Roman"/>
-        </w:rPr>
-        <w:t xml:space="preserve"> to generate personalized role recommendations and learning roadmaps</w:t>
+        <w:t xml:space="preserve"> career guidance, achieving 3-second end-to-end latency and 5-millisecond vector searches, directly improving recommendation relevance and user experience</w:t>
       </w:r>
     </w:p>
     <w:p>
@@ -924,21 +973,7 @@
         <w:rPr>
           <w:rFonts w:ascii="Lato" w:hAnsi="Lato" w:cs="Times New Roman"/>
         </w:rPr>
-        <w:t xml:space="preserve">Developed </w:t>
-      </w:r>
-      <w:proofErr w:type="spellStart"/>
-      <w:r>
-        <w:rPr>
-          <w:rFonts w:ascii="Lato" w:hAnsi="Lato" w:cs="Times New Roman"/>
-        </w:rPr>
-        <w:t>FastAPI</w:t>
-      </w:r>
-      <w:proofErr w:type="spellEnd"/>
-      <w:r>
-        <w:rPr>
-          <w:rFonts w:ascii="Lato" w:hAnsi="Lato" w:cs="Times New Roman"/>
-        </w:rPr>
-        <w:t xml:space="preserve"> ML services for retrieval, semantic re-ranking, enrichment-pack generation, and skill-gap analysis, achieving 3 second end-to-end latency and 5 millisecond vector searches</w:t>
+        <w:t>Scaled internal role coverage by 380% (200 → 960 roles) through automated web scraping and metadata enrichment, significantly broadening the system's recommendation scope</w:t>
       </w:r>
     </w:p>
     <w:p>
@@ -957,38 +992,21 @@
         <w:rPr>
           <w:rFonts w:ascii="Lato" w:hAnsi="Lato" w:cs="Times New Roman"/>
         </w:rPr>
-        <w:t>Expanded internal datasets from 200 to 960 roles via automated web scraping and metadata enrichment, improving coverage and contextual accuracy</w:t>
+        <w:t xml:space="preserve">Designed and deployed skill-gap analysis and semantic re-ranking services via </w:t>
       </w:r>
-    </w:p>
-    <w:p>
-      <w:pPr>
-        <w:pStyle w:val="ListBullet"/>
-        <w:numPr>
-          <w:ilvl w:val="0"/>
-          <w:numId w:val="21"/>
-        </w:numPr>
-        <w:jc w:val="both"/>
-        <w:rPr>
-          <w:rFonts w:ascii="Lato" w:hAnsi="Lato" w:cs="Times New Roman"/>
-        </w:rPr>
-      </w:pPr>
+      <w:proofErr w:type="spellStart"/>
       <w:r>
         <w:rPr>
           <w:rFonts w:ascii="Lato" w:hAnsi="Lato" w:cs="Times New Roman"/>
         </w:rPr>
-        <w:t xml:space="preserve">Integrated Google and Outlook Calendar APIs and contributed to Next.js and TypeScript components for roadmap visualization while collaborating in </w:t>
+        <w:t>FastAPI</w:t>
       </w:r>
+      <w:proofErr w:type="spellEnd"/>
       <w:r>
         <w:rPr>
           <w:rFonts w:ascii="Lato" w:hAnsi="Lato" w:cs="Times New Roman"/>
         </w:rPr>
-        <w:t>an</w:t>
-      </w:r>
-      <w:r>
-        <w:rPr>
-          <w:rFonts w:ascii="Lato" w:hAnsi="Lato" w:cs="Times New Roman"/>
-        </w:rPr>
-        <w:t xml:space="preserve"> Agile team</w:t>
+        <w:t>, enabling accurate, context-aware role matching at production scale</w:t>
       </w:r>
     </w:p>
     <w:p>
@@ -1008,7 +1026,21 @@
         <w:rPr>
           <w:rFonts w:ascii="Lato" w:hAnsi="Lato" w:cs="Times New Roman"/>
         </w:rPr>
-        <w:t>Implemented logging, monitoring, and evaluation scripts to support iterative experimentation and system reliability</w:t>
+        <w:t xml:space="preserve">Contributed to full-stack delivery across ML services and frontend roadmap </w:t>
+      </w:r>
+      <w:proofErr w:type="spellStart"/>
+      <w:r>
+        <w:rPr>
+          <w:rFonts w:ascii="Lato" w:hAnsi="Lato" w:cs="Times New Roman"/>
+        </w:rPr>
+        <w:t>visualisation</w:t>
+      </w:r>
+      <w:proofErr w:type="spellEnd"/>
+      <w:r>
+        <w:rPr>
+          <w:rFonts w:ascii="Lato" w:hAnsi="Lato" w:cs="Times New Roman"/>
+        </w:rPr>
+        <w:t xml:space="preserve"> components within an Agile team, while implementing logging and evaluation pipelines to support continuous experimentation</w:t>
       </w:r>
     </w:p>
     <w:p>
@@ -1115,7 +1147,554 @@
           <w:tab w:val="clear" w:pos="9360"/>
           <w:tab w:val="right" w:pos="10773"/>
         </w:tabs>
-        <w:spacing w:before="0" w:after="80"/>
+        <w:spacing w:before="0" w:after="40"/>
+        <w:jc w:val="both"/>
+        <w:rPr>
+          <w:rFonts w:ascii="Lato" w:hAnsi="Lato" w:cs="Times New Roman"/>
+          <w:color w:val="000000" w:themeColor="text1"/>
+        </w:rPr>
+      </w:pPr>
+      <w:bookmarkStart w:id="1" w:name="_Hlk213280283"/>
+      <w:proofErr w:type="gramStart"/>
+      <w:r>
+        <w:rPr>
+          <w:rFonts w:ascii="Lato" w:hAnsi="Lato" w:cs="Times New Roman"/>
+          <w:bCs/>
+          <w:color w:val="000000" w:themeColor="text1"/>
+        </w:rPr>
+        <w:t>Social Media</w:t>
+      </w:r>
+      <w:proofErr w:type="gramEnd"/>
+      <w:r>
+        <w:rPr>
+          <w:rFonts w:ascii="Lato" w:hAnsi="Lato" w:cs="Times New Roman"/>
+          <w:bCs/>
+          <w:color w:val="000000" w:themeColor="text1"/>
+        </w:rPr>
+        <w:t xml:space="preserve"> &amp; Network Analysis </w:t>
+      </w:r>
+      <w:r>
+        <w:rPr>
+          <w:rFonts w:ascii="Lato" w:hAnsi="Lato" w:cs="Times New Roman"/>
+          <w:bCs/>
+          <w:color w:val="000000" w:themeColor="text1"/>
+        </w:rPr>
+        <w:t xml:space="preserve">| </w:t>
+      </w:r>
+      <w:r>
+        <w:rPr>
+          <w:rFonts w:ascii="Lato" w:hAnsi="Lato" w:cs="Times New Roman"/>
+          <w:bCs/>
+          <w:color w:val="000000" w:themeColor="text1"/>
+        </w:rPr>
+        <w:t xml:space="preserve">Russia-Ukraine War </w:t>
+      </w:r>
+      <w:r>
+        <w:rPr>
+          <w:rFonts w:ascii="Lato" w:hAnsi="Lato" w:cs="Times New Roman"/>
+          <w:bCs/>
+          <w:color w:val="000000" w:themeColor="text1"/>
+        </w:rPr>
+        <w:t>(Reddit + YouTube)</w:t>
+      </w:r>
+      <w:r>
+        <w:rPr>
+          <w:rFonts w:ascii="Lato" w:hAnsi="Lato" w:cs="Times New Roman"/>
+          <w:bCs/>
+          <w:color w:val="000000" w:themeColor="text1"/>
+        </w:rPr>
+        <w:t xml:space="preserve"> | RMIT</w:t>
+      </w:r>
+    </w:p>
+    <w:p>
+      <w:pPr>
+        <w:pStyle w:val="ListBullet"/>
+        <w:numPr>
+          <w:ilvl w:val="0"/>
+          <w:numId w:val="0"/>
+        </w:numPr>
+        <w:jc w:val="both"/>
+        <w:rPr>
+          <w:rFonts w:ascii="Lato" w:hAnsi="Lato" w:cs="Times New Roman"/>
+          <w:i/>
+          <w:iCs/>
+          <w:color w:val="404040" w:themeColor="text1" w:themeTint="BF"/>
+        </w:rPr>
+      </w:pPr>
+      <w:r>
+        <w:rPr>
+          <w:rFonts w:ascii="Lato" w:hAnsi="Lato" w:cs="Times New Roman"/>
+          <w:i/>
+          <w:iCs/>
+          <w:color w:val="404040" w:themeColor="text1" w:themeTint="BF"/>
+        </w:rPr>
+        <w:t xml:space="preserve">Python, PRAW, YouTube API, NLP, LDA, VADER, </w:t>
+      </w:r>
+      <w:proofErr w:type="spellStart"/>
+      <w:r>
+        <w:rPr>
+          <w:rFonts w:ascii="Lato" w:hAnsi="Lato" w:cs="Times New Roman"/>
+          <w:i/>
+          <w:iCs/>
+          <w:color w:val="404040" w:themeColor="text1" w:themeTint="BF"/>
+        </w:rPr>
+        <w:t>NetworkX</w:t>
+      </w:r>
+      <w:proofErr w:type="spellEnd"/>
+      <w:r>
+        <w:rPr>
+          <w:rFonts w:ascii="Lato" w:hAnsi="Lato" w:cs="Times New Roman"/>
+          <w:i/>
+          <w:iCs/>
+          <w:color w:val="404040" w:themeColor="text1" w:themeTint="BF"/>
+        </w:rPr>
+        <w:t>, Louvain</w:t>
+      </w:r>
+    </w:p>
+    <w:p>
+      <w:pPr>
+        <w:pStyle w:val="ListBullet"/>
+        <w:numPr>
+          <w:ilvl w:val="0"/>
+          <w:numId w:val="23"/>
+        </w:numPr>
+        <w:ind w:left="530"/>
+        <w:jc w:val="both"/>
+        <w:rPr>
+          <w:rFonts w:ascii="Lato" w:hAnsi="Lato" w:cs="Times New Roman"/>
+        </w:rPr>
+      </w:pPr>
+      <w:r>
+        <w:rPr>
+          <w:rFonts w:ascii="Lato" w:hAnsi="Lato" w:cs="Times New Roman"/>
+        </w:rPr>
+        <w:t xml:space="preserve">Collected and preprocessed 90,000+ comments from Reddit and YouTube, building an NLP pipeline using VADER sentiment analysis and LDA topic modelling to </w:t>
+      </w:r>
+      <w:proofErr w:type="spellStart"/>
+      <w:r>
+        <w:rPr>
+          <w:rFonts w:ascii="Lato" w:hAnsi="Lato" w:cs="Times New Roman"/>
+        </w:rPr>
+        <w:t>analyse</w:t>
+      </w:r>
+      <w:proofErr w:type="spellEnd"/>
+      <w:r>
+        <w:rPr>
+          <w:rFonts w:ascii="Lato" w:hAnsi="Lato" w:cs="Times New Roman"/>
+        </w:rPr>
+        <w:t xml:space="preserve"> cross-platform narrative patterns</w:t>
+      </w:r>
+    </w:p>
+    <w:p>
+      <w:pPr>
+        <w:pStyle w:val="ListBullet"/>
+        <w:numPr>
+          <w:ilvl w:val="0"/>
+          <w:numId w:val="23"/>
+        </w:numPr>
+        <w:ind w:left="530"/>
+        <w:jc w:val="both"/>
+        <w:rPr>
+          <w:rFonts w:ascii="Lato" w:hAnsi="Lato" w:cs="Times New Roman"/>
+        </w:rPr>
+      </w:pPr>
+      <w:r>
+        <w:rPr>
+          <w:rFonts w:ascii="Lato" w:hAnsi="Lato" w:cs="Times New Roman"/>
+        </w:rPr>
+        <w:t xml:space="preserve">Detected platform-level </w:t>
+      </w:r>
+      <w:proofErr w:type="spellStart"/>
+      <w:r>
+        <w:rPr>
+          <w:rFonts w:ascii="Lato" w:hAnsi="Lato" w:cs="Times New Roman"/>
+        </w:rPr>
+        <w:t>behavioural</w:t>
+      </w:r>
+      <w:proofErr w:type="spellEnd"/>
+      <w:r>
+        <w:rPr>
+          <w:rFonts w:ascii="Lato" w:hAnsi="Lato" w:cs="Times New Roman"/>
+        </w:rPr>
+        <w:t xml:space="preserve"> divergence: YouTube exhibited </w:t>
+      </w:r>
+      <w:proofErr w:type="spellStart"/>
+      <w:r>
+        <w:rPr>
+          <w:rFonts w:ascii="Lato" w:hAnsi="Lato" w:cs="Times New Roman"/>
+        </w:rPr>
+        <w:t>centralised</w:t>
+      </w:r>
+      <w:proofErr w:type="spellEnd"/>
+      <w:r>
+        <w:rPr>
+          <w:rFonts w:ascii="Lato" w:hAnsi="Lato" w:cs="Times New Roman"/>
+        </w:rPr>
+        <w:t xml:space="preserve">, echo-chamber-like community structures (Louvain Q=0.895, 600 communities) compared to Reddit's </w:t>
+      </w:r>
+      <w:proofErr w:type="spellStart"/>
+      <w:r>
+        <w:rPr>
+          <w:rFonts w:ascii="Lato" w:hAnsi="Lato" w:cs="Times New Roman"/>
+        </w:rPr>
+        <w:t>decentralised</w:t>
+      </w:r>
+      <w:proofErr w:type="spellEnd"/>
+      <w:r>
+        <w:rPr>
+          <w:rFonts w:ascii="Lato" w:hAnsi="Lato" w:cs="Times New Roman"/>
+        </w:rPr>
+        <w:t xml:space="preserve"> discourse (Q=0.571, 237 communities)</w:t>
+      </w:r>
+    </w:p>
+    <w:p>
+      <w:pPr>
+        <w:pStyle w:val="ListBullet"/>
+        <w:numPr>
+          <w:ilvl w:val="0"/>
+          <w:numId w:val="23"/>
+        </w:numPr>
+        <w:spacing w:after="120"/>
+        <w:ind w:left="530"/>
+        <w:jc w:val="both"/>
+        <w:rPr>
+          <w:rFonts w:ascii="Lato" w:hAnsi="Lato" w:cs="Times New Roman"/>
+        </w:rPr>
+      </w:pPr>
+      <w:r>
+        <w:rPr>
+          <w:rFonts w:ascii="Lato" w:hAnsi="Lato" w:cs="Times New Roman"/>
+        </w:rPr>
+        <w:t xml:space="preserve">Modelled information diffusion using the Independent Cascade algorithm, revealing YouTube's </w:t>
+      </w:r>
+      <w:proofErr w:type="spellStart"/>
+      <w:r>
+        <w:rPr>
+          <w:rFonts w:ascii="Lato" w:hAnsi="Lato" w:cs="Times New Roman"/>
+        </w:rPr>
+        <w:t>centralised</w:t>
+      </w:r>
+      <w:proofErr w:type="spellEnd"/>
+      <w:r>
+        <w:rPr>
+          <w:rFonts w:ascii="Lato" w:hAnsi="Lato" w:cs="Times New Roman"/>
+        </w:rPr>
+        <w:t xml:space="preserve"> hubs as amplifiers of emotionally charged, leader-focused content vs Reddit's broader geopolitical topic spread</w:t>
+      </w:r>
+    </w:p>
+    <w:p>
+      <w:pPr>
+        <w:pStyle w:val="Heading2"/>
+        <w:spacing w:before="0" w:after="40"/>
+        <w:rPr>
+          <w:rFonts w:ascii="Lato" w:hAnsi="Lato" w:cs="Times New Roman"/>
+        </w:rPr>
+      </w:pPr>
+      <w:r>
+        <w:rPr>
+          <w:rFonts w:ascii="Lato" w:hAnsi="Lato" w:cs="Times New Roman"/>
+        </w:rPr>
+        <w:t>Few</w:t>
+      </w:r>
+      <w:r>
+        <w:rPr>
+          <w:rFonts w:ascii="Lato" w:hAnsi="Lato" w:cs="Times New Roman"/>
+        </w:rPr>
+        <w:noBreakHyphen/>
+        <w:t>Shot Learning for Hyperspectral Data</w:t>
+      </w:r>
+      <w:r>
+        <w:rPr>
+          <w:rFonts w:ascii="Lato" w:hAnsi="Lato" w:cs="Times New Roman"/>
+        </w:rPr>
+        <w:t xml:space="preserve"> | Final Year Project | IIT Bombay</w:t>
+      </w:r>
+    </w:p>
+    <w:p>
+      <w:pPr>
+        <w:pStyle w:val="ListBullet"/>
+        <w:numPr>
+          <w:ilvl w:val="0"/>
+          <w:numId w:val="0"/>
+        </w:numPr>
+        <w:jc w:val="both"/>
+        <w:rPr>
+          <w:rFonts w:ascii="Lato" w:hAnsi="Lato" w:cs="Times New Roman"/>
+          <w:i/>
+          <w:iCs/>
+          <w:color w:val="404040" w:themeColor="text1" w:themeTint="BF"/>
+        </w:rPr>
+      </w:pPr>
+      <w:proofErr w:type="spellStart"/>
+      <w:r>
+        <w:rPr>
+          <w:rFonts w:ascii="Lato" w:hAnsi="Lato" w:cs="Times New Roman"/>
+          <w:i/>
+          <w:iCs/>
+          <w:color w:val="404040" w:themeColor="text1" w:themeTint="BF"/>
+        </w:rPr>
+        <w:t>PyTorch</w:t>
+      </w:r>
+      <w:proofErr w:type="spellEnd"/>
+      <w:r>
+        <w:rPr>
+          <w:rFonts w:ascii="Lato" w:hAnsi="Lato" w:cs="Times New Roman"/>
+          <w:i/>
+          <w:iCs/>
+          <w:color w:val="404040" w:themeColor="text1" w:themeTint="BF"/>
+        </w:rPr>
+        <w:t>, TensorFlow, Deep Learning, Attention Mechanisms</w:t>
+      </w:r>
+    </w:p>
+    <w:p>
+      <w:pPr>
+        <w:pStyle w:val="ListBullet"/>
+        <w:numPr>
+          <w:ilvl w:val="0"/>
+          <w:numId w:val="22"/>
+        </w:numPr>
+        <w:ind w:left="530"/>
+        <w:jc w:val="both"/>
+        <w:rPr>
+          <w:rFonts w:ascii="Lato" w:hAnsi="Lato" w:cs="Times New Roman"/>
+          <w:lang w:val="en-AU"/>
+        </w:rPr>
+      </w:pPr>
+      <w:r>
+        <w:rPr>
+          <w:rFonts w:ascii="Lato" w:hAnsi="Lato" w:cs="Times New Roman"/>
+          <w:lang w:val="en-AU"/>
+        </w:rPr>
+        <w:t>Surpassed published paper benchmarks by integrating Temperature Scaling and Attention mechanisms into a Few-Shot Learning model, achieving 99.55% Overall Accuracy vs the paper's 98.16% baseline</w:t>
+      </w:r>
+    </w:p>
+    <w:p>
+      <w:pPr>
+        <w:pStyle w:val="ListBullet"/>
+        <w:numPr>
+          <w:ilvl w:val="0"/>
+          <w:numId w:val="22"/>
+        </w:numPr>
+        <w:ind w:left="530"/>
+        <w:jc w:val="both"/>
+        <w:rPr>
+          <w:rFonts w:ascii="Lato" w:hAnsi="Lato" w:cs="Times New Roman"/>
+          <w:lang w:val="en-AU"/>
+        </w:rPr>
+      </w:pPr>
+      <w:r>
+        <w:rPr>
+          <w:rFonts w:ascii="Lato" w:hAnsi="Lato" w:cs="Times New Roman"/>
+          <w:lang w:val="en-AU"/>
+        </w:rPr>
+        <w:t xml:space="preserve">Designed and validated the architecture across multiple HSI benchmarks using ablation studies, confirming that Attention was the key driver </w:t>
+      </w:r>
+      <w:r>
+        <w:rPr>
+          <w:rFonts w:ascii="Lato" w:hAnsi="Lato" w:cs="Times New Roman"/>
+          <w:lang w:val="en-AU"/>
+        </w:rPr>
+        <w:t>-</w:t>
+      </w:r>
+      <w:r>
+        <w:rPr>
+          <w:rFonts w:ascii="Lato" w:hAnsi="Lato" w:cs="Times New Roman"/>
+          <w:lang w:val="en-AU"/>
+        </w:rPr>
+        <w:t xml:space="preserve"> Temperature Scaling alone underperformed the baseline (97.21%)</w:t>
+      </w:r>
+    </w:p>
+    <w:p>
+      <w:pPr>
+        <w:pStyle w:val="ListBullet"/>
+        <w:numPr>
+          <w:ilvl w:val="0"/>
+          <w:numId w:val="22"/>
+        </w:numPr>
+        <w:spacing w:after="120"/>
+        <w:ind w:left="530"/>
+        <w:jc w:val="both"/>
+        <w:rPr>
+          <w:rFonts w:ascii="Lato" w:hAnsi="Lato" w:cs="Times New Roman"/>
+          <w:lang w:val="en-AU"/>
+        </w:rPr>
+      </w:pPr>
+      <w:r>
+        <w:rPr>
+          <w:rFonts w:ascii="Lato" w:hAnsi="Lato" w:cs="Times New Roman"/>
+          <w:lang w:val="en-AU"/>
+        </w:rPr>
+        <w:t>Performed spectral-spatial preprocessing and feature extraction on curated HSI datasets to improve model generalisation across high-dimensional class distributions</w:t>
+      </w:r>
+    </w:p>
+    <w:p>
+      <w:pPr>
+        <w:pStyle w:val="Heading2"/>
+        <w:spacing w:before="0" w:after="40"/>
+        <w:rPr>
+          <w:rFonts w:ascii="Lato" w:hAnsi="Lato" w:cs="Times New Roman"/>
+        </w:rPr>
+      </w:pPr>
+      <w:r>
+        <w:rPr>
+          <w:rFonts w:ascii="Lato" w:hAnsi="Lato" w:cs="Times New Roman"/>
+        </w:rPr>
+        <w:t>NLP Clothing Review Classification &amp; Web Application | RMIT</w:t>
+      </w:r>
+    </w:p>
+    <w:p>
+      <w:pPr>
+        <w:pStyle w:val="ListBullet"/>
+        <w:numPr>
+          <w:ilvl w:val="0"/>
+          <w:numId w:val="0"/>
+        </w:numPr>
+        <w:jc w:val="both"/>
+        <w:rPr>
+          <w:rFonts w:ascii="Lato" w:hAnsi="Lato" w:cs="Times New Roman"/>
+          <w:i/>
+          <w:iCs/>
+          <w:color w:val="404040" w:themeColor="text1" w:themeTint="BF"/>
+        </w:rPr>
+      </w:pPr>
+      <w:r>
+        <w:rPr>
+          <w:rFonts w:ascii="Lato" w:hAnsi="Lato" w:cs="Times New Roman"/>
+          <w:i/>
+          <w:iCs/>
+          <w:color w:val="404040" w:themeColor="text1" w:themeTint="BF"/>
+        </w:rPr>
+        <w:t xml:space="preserve">TensorFlow, </w:t>
+      </w:r>
+      <w:proofErr w:type="spellStart"/>
+      <w:r>
+        <w:rPr>
+          <w:rFonts w:ascii="Lato" w:hAnsi="Lato" w:cs="Times New Roman"/>
+          <w:i/>
+          <w:iCs/>
+          <w:color w:val="404040" w:themeColor="text1" w:themeTint="BF"/>
+        </w:rPr>
+        <w:t>FastText</w:t>
+      </w:r>
+      <w:proofErr w:type="spellEnd"/>
+      <w:r>
+        <w:rPr>
+          <w:rFonts w:ascii="Lato" w:hAnsi="Lato" w:cs="Times New Roman"/>
+          <w:i/>
+          <w:iCs/>
+          <w:color w:val="404040" w:themeColor="text1" w:themeTint="BF"/>
+        </w:rPr>
+        <w:t>, TF</w:t>
+      </w:r>
+      <w:r>
+        <w:rPr>
+          <w:rFonts w:ascii="Lato" w:hAnsi="Lato" w:cs="Times New Roman"/>
+          <w:i/>
+          <w:iCs/>
+          <w:color w:val="404040" w:themeColor="text1" w:themeTint="BF"/>
+        </w:rPr>
+        <w:noBreakHyphen/>
+        <w:t>IDF, Logistic Regression, Flask</w:t>
+      </w:r>
+    </w:p>
+    <w:p>
+      <w:pPr>
+        <w:pStyle w:val="ListBullet"/>
+        <w:numPr>
+          <w:ilvl w:val="0"/>
+          <w:numId w:val="24"/>
+        </w:numPr>
+        <w:ind w:left="530"/>
+        <w:jc w:val="both"/>
+        <w:rPr>
+          <w:rFonts w:ascii="Lato" w:hAnsi="Lato" w:cs="Times New Roman"/>
+        </w:rPr>
+      </w:pPr>
+      <w:r>
+        <w:rPr>
+          <w:rFonts w:ascii="Lato" w:hAnsi="Lato" w:cs="Times New Roman"/>
+        </w:rPr>
+        <w:t xml:space="preserve">Engineered and benchmarked five feature representations (Bag-of-Words, TF-IDF, embeddings, title-only, combined), with the </w:t>
+      </w:r>
+      <w:proofErr w:type="spellStart"/>
+      <w:r>
+        <w:rPr>
+          <w:rFonts w:ascii="Lato" w:hAnsi="Lato" w:cs="Times New Roman"/>
+        </w:rPr>
+        <w:t>Title+Review</w:t>
+      </w:r>
+      <w:proofErr w:type="spellEnd"/>
+      <w:r>
+        <w:rPr>
+          <w:rFonts w:ascii="Lato" w:hAnsi="Lato" w:cs="Times New Roman"/>
+        </w:rPr>
+        <w:t xml:space="preserve"> combination achieving the highest mean accuracy of 88.97% across 5-fold cross-validation</w:t>
+      </w:r>
+    </w:p>
+    <w:p>
+      <w:pPr>
+        <w:pStyle w:val="ListBullet"/>
+        <w:numPr>
+          <w:ilvl w:val="0"/>
+          <w:numId w:val="24"/>
+        </w:numPr>
+        <w:ind w:left="530"/>
+        <w:jc w:val="both"/>
+        <w:rPr>
+          <w:rFonts w:ascii="Lato" w:hAnsi="Lato" w:cs="Times New Roman"/>
+        </w:rPr>
+      </w:pPr>
+      <w:r>
+        <w:rPr>
+          <w:rFonts w:ascii="Lato" w:hAnsi="Lato" w:cs="Times New Roman"/>
+        </w:rPr>
+        <w:lastRenderedPageBreak/>
+        <w:t xml:space="preserve">Trained and compared multiple classifiers (Logistic Regression, </w:t>
+      </w:r>
+      <w:proofErr w:type="spellStart"/>
+      <w:r>
+        <w:rPr>
+          <w:rFonts w:ascii="Lato" w:hAnsi="Lato" w:cs="Times New Roman"/>
+        </w:rPr>
+        <w:t>FastText</w:t>
+      </w:r>
+      <w:proofErr w:type="spellEnd"/>
+      <w:r>
+        <w:rPr>
+          <w:rFonts w:ascii="Lato" w:hAnsi="Lato" w:cs="Times New Roman"/>
+        </w:rPr>
+        <w:t>, deep learning) to identify the optimal model, with combined text features consistently outperforming single-input baselines by up to 2.3%</w:t>
+      </w:r>
+    </w:p>
+    <w:p>
+      <w:pPr>
+        <w:pStyle w:val="ListBullet"/>
+        <w:numPr>
+          <w:ilvl w:val="0"/>
+          <w:numId w:val="24"/>
+        </w:numPr>
+        <w:spacing w:after="120"/>
+        <w:ind w:left="530"/>
+        <w:jc w:val="both"/>
+        <w:rPr>
+          <w:rFonts w:ascii="Lato" w:hAnsi="Lato" w:cs="Times New Roman"/>
+        </w:rPr>
+      </w:pPr>
+      <w:r>
+        <w:rPr>
+          <w:rFonts w:ascii="Lato" w:hAnsi="Lato" w:cs="Times New Roman"/>
+        </w:rPr>
+        <w:t>Deployed the best-performing model into a Flask web application supporting real-time recommendation prediction, keyword search, and user review submission</w:t>
+      </w:r>
+    </w:p>
+    <w:p>
+      <w:pPr>
+        <w:pStyle w:val="Heading2"/>
+        <w:tabs>
+          <w:tab w:val="clear" w:pos="9360"/>
+          <w:tab w:val="right" w:pos="10773"/>
+        </w:tabs>
+        <w:spacing w:before="0" w:after="40"/>
         <w:jc w:val="both"/>
         <w:rPr>
           <w:rFonts w:ascii="Lato" w:hAnsi="Lato" w:cs="Times New Roman"/>
@@ -1123,7 +1702,6 @@
           <w:iCs/>
         </w:rPr>
       </w:pPr>
-      <w:bookmarkStart w:id="1" w:name="_Hlk213280283"/>
       <w:r>
         <w:rPr>
           <w:rFonts w:ascii="Lato" w:hAnsi="Lato" w:cs="Times New Roman"/>
@@ -1169,6 +1747,7 @@
           <w:rFonts w:ascii="Lato" w:hAnsi="Lato" w:cs="Times New Roman"/>
           <w:i/>
           <w:iCs/>
+          <w:color w:val="404040" w:themeColor="text1" w:themeTint="BF"/>
         </w:rPr>
       </w:pPr>
       <w:r>
@@ -1176,6 +1755,7 @@
           <w:rFonts w:ascii="Lato" w:hAnsi="Lato" w:cs="Times New Roman"/>
           <w:i/>
           <w:iCs/>
+          <w:color w:val="404040" w:themeColor="text1" w:themeTint="BF"/>
           <w:lang w:val="en-AU"/>
         </w:rPr>
         <w:t>AWS EC2, S3, DynamoDB, API Gateway, Lambda, Ubuntu, Apache2</w:t>
@@ -1198,7 +1778,7 @@
         <w:rPr>
           <w:rFonts w:ascii="Lato" w:hAnsi="Lato" w:cs="Times New Roman"/>
         </w:rPr>
-        <w:t>Developed a fully deployed cloud application hosted on an EC2 Ubuntu server using Apache2, accessible via public DNS</w:t>
+        <w:t>Deployed a fully functional cloud application on an EC2 Ubuntu server using Apache2, accessible via public DNS, demonstrating scalable AWS architecture</w:t>
       </w:r>
     </w:p>
     <w:p>
@@ -1218,79 +1798,21 @@
         <w:rPr>
           <w:rFonts w:ascii="Lato" w:hAnsi="Lato" w:cs="Times New Roman"/>
         </w:rPr>
-        <w:t>Designed and implemented DynamoDB schemas for login, music, and subscription data with optimized key structures</w:t>
+        <w:t xml:space="preserve">Designed DynamoDB schemas for login, music, and subscription data with </w:t>
       </w:r>
-    </w:p>
-    <w:p>
-      <w:pPr>
-        <w:pStyle w:val="ListBullet"/>
-        <w:numPr>
-          <w:ilvl w:val="0"/>
-          <w:numId w:val="23"/>
-        </w:numPr>
-        <w:ind w:left="530"/>
-        <w:jc w:val="both"/>
-        <w:rPr>
-          <w:rFonts w:ascii="Lato" w:hAnsi="Lato" w:cs="Times New Roman"/>
-        </w:rPr>
-      </w:pPr>
+      <w:proofErr w:type="spellStart"/>
       <w:r>
         <w:rPr>
           <w:rFonts w:ascii="Lato" w:hAnsi="Lato" w:cs="Times New Roman"/>
         </w:rPr>
-        <w:t>Built backend logic for login, registration, subscription management, and music queries using DynamoDB read/write operations</w:t>
+        <w:t>optimised</w:t>
       </w:r>
-    </w:p>
-    <w:p>
-      <w:pPr>
-        <w:pStyle w:val="ListBullet"/>
-        <w:numPr>
-          <w:ilvl w:val="0"/>
-          <w:numId w:val="23"/>
-        </w:numPr>
-        <w:ind w:left="530"/>
-        <w:jc w:val="both"/>
-        <w:rPr>
-          <w:rFonts w:ascii="Lato" w:hAnsi="Lato" w:cs="Times New Roman"/>
-        </w:rPr>
-      </w:pPr>
+      <w:proofErr w:type="spellEnd"/>
       <w:r>
         <w:rPr>
           <w:rFonts w:ascii="Lato" w:hAnsi="Lato" w:cs="Times New Roman"/>
         </w:rPr>
-        <w:t>Automated image retrieval and upload by downloading artist images and storing them securely in S3</w:t>
-      </w:r>
-    </w:p>
-    <w:p>
-      <w:pPr>
-        <w:pStyle w:val="ListBullet"/>
-        <w:numPr>
-          <w:ilvl w:val="0"/>
-          <w:numId w:val="23"/>
-        </w:numPr>
-        <w:ind w:left="530"/>
-        <w:jc w:val="both"/>
-        <w:rPr>
-          <w:rFonts w:ascii="Lato" w:hAnsi="Lato" w:cs="Times New Roman"/>
-        </w:rPr>
-      </w:pPr>
-      <w:r>
-        <w:rPr>
-          <w:rFonts w:ascii="Lato" w:hAnsi="Lato" w:cs="Times New Roman"/>
-        </w:rPr>
-        <w:t xml:space="preserve">Integrated API Gateway </w:t>
-      </w:r>
-      <w:r>
-        <w:rPr>
-          <w:rFonts w:ascii="Lato" w:hAnsi="Lato" w:cs="Times New Roman"/>
-        </w:rPr>
-        <w:t>and</w:t>
-      </w:r>
-      <w:r>
-        <w:rPr>
-          <w:rFonts w:ascii="Lato" w:hAnsi="Lato" w:cs="Times New Roman"/>
-        </w:rPr>
-        <w:t xml:space="preserve"> Lambda to process user registration, subscription updates, and data retrieval through REST APIs</w:t>
+        <w:t xml:space="preserve"> key structures and built backend logic for registration, subscription management, and music queries</w:t>
       </w:r>
     </w:p>
     <w:p>
@@ -1311,776 +1833,10 @@
         <w:rPr>
           <w:rFonts w:ascii="Lato" w:hAnsi="Lato" w:cs="Times New Roman"/>
         </w:rPr>
-        <w:t>Delivered a complete end</w:t>
-      </w:r>
-      <w:r>
-        <w:rPr>
-          <w:rFonts w:ascii="Cambria Math" w:hAnsi="Cambria Math" w:cs="Cambria Math"/>
-        </w:rPr>
-        <w:t>‑</w:t>
-      </w:r>
-      <w:r>
-        <w:rPr>
-          <w:rFonts w:ascii="Lato" w:hAnsi="Lato" w:cs="Times New Roman"/>
-        </w:rPr>
-        <w:t>to</w:t>
-      </w:r>
-      <w:r>
-        <w:rPr>
-          <w:rFonts w:ascii="Cambria Math" w:hAnsi="Cambria Math" w:cs="Cambria Math"/>
-        </w:rPr>
-        <w:t>‑</w:t>
-      </w:r>
-      <w:r>
-        <w:rPr>
-          <w:rFonts w:ascii="Lato" w:hAnsi="Lato" w:cs="Times New Roman"/>
-        </w:rPr>
-        <w:t>end cloud solution demonstrating scalable architecture and AWS best practices</w:t>
-      </w:r>
-    </w:p>
-    <w:p>
-      <w:pPr>
-        <w:pStyle w:val="Heading2"/>
-        <w:tabs>
-          <w:tab w:val="clear" w:pos="9360"/>
-          <w:tab w:val="right" w:pos="10773"/>
-        </w:tabs>
-        <w:spacing w:before="0" w:after="80"/>
-        <w:jc w:val="both"/>
-        <w:rPr>
-          <w:rFonts w:ascii="Lato" w:hAnsi="Lato" w:cs="Times New Roman"/>
-          <w:color w:val="000000" w:themeColor="text1"/>
-        </w:rPr>
-      </w:pPr>
-      <w:r>
-        <w:rPr>
-          <w:rFonts w:ascii="Lato" w:hAnsi="Lato" w:cs="Times New Roman"/>
-          <w:bCs/>
-          <w:color w:val="000000" w:themeColor="text1"/>
-        </w:rPr>
-        <w:t>Russia</w:t>
-      </w:r>
-      <w:r>
-        <w:rPr>
-          <w:rFonts w:ascii="Lato" w:hAnsi="Lato" w:cs="Times New Roman"/>
-          <w:bCs/>
-          <w:color w:val="000000" w:themeColor="text1"/>
-        </w:rPr>
-        <w:t>-</w:t>
-      </w:r>
-      <w:r>
-        <w:rPr>
-          <w:rFonts w:ascii="Lato" w:hAnsi="Lato" w:cs="Times New Roman"/>
-          <w:bCs/>
-          <w:color w:val="000000" w:themeColor="text1"/>
-        </w:rPr>
-        <w:t xml:space="preserve">Ukraine </w:t>
-      </w:r>
-      <w:r>
-        <w:rPr>
-          <w:rFonts w:ascii="Lato" w:hAnsi="Lato" w:cs="Times New Roman"/>
-          <w:bCs/>
-          <w:color w:val="000000" w:themeColor="text1"/>
-        </w:rPr>
-        <w:t xml:space="preserve">War | </w:t>
-      </w:r>
-      <w:r>
-        <w:rPr>
-          <w:rFonts w:ascii="Lato" w:hAnsi="Lato" w:cs="Times New Roman"/>
-          <w:bCs/>
-          <w:color w:val="000000" w:themeColor="text1"/>
-        </w:rPr>
-        <w:t>Social Media &amp; Network Analysis (Reddit + YouTube)</w:t>
-      </w:r>
-      <w:r>
-        <w:rPr>
-          <w:rFonts w:ascii="Lato" w:hAnsi="Lato" w:cs="Times New Roman"/>
-          <w:bCs/>
-          <w:color w:val="000000" w:themeColor="text1"/>
-        </w:rPr>
-        <w:t xml:space="preserve"> | RMIT</w:t>
-      </w:r>
-    </w:p>
-    <w:p>
-      <w:pPr>
-        <w:pStyle w:val="ListBullet"/>
-        <w:numPr>
-          <w:ilvl w:val="0"/>
-          <w:numId w:val="0"/>
-        </w:numPr>
-        <w:jc w:val="both"/>
-        <w:rPr>
-          <w:rFonts w:ascii="Lato" w:hAnsi="Lato" w:cs="Times New Roman"/>
-          <w:i/>
-          <w:iCs/>
-        </w:rPr>
-      </w:pPr>
-      <w:r>
-        <w:rPr>
-          <w:rFonts w:ascii="Lato" w:hAnsi="Lato" w:cs="Times New Roman"/>
-          <w:i/>
-          <w:iCs/>
-        </w:rPr>
-        <w:t xml:space="preserve">Python, PRAW, YouTube API, NLP, LDA, VADER, </w:t>
-      </w:r>
-      <w:proofErr w:type="spellStart"/>
-      <w:r>
-        <w:rPr>
-          <w:rFonts w:ascii="Lato" w:hAnsi="Lato" w:cs="Times New Roman"/>
-          <w:i/>
-          <w:iCs/>
-        </w:rPr>
-        <w:t>NetworkX</w:t>
-      </w:r>
-      <w:proofErr w:type="spellEnd"/>
-      <w:r>
-        <w:rPr>
-          <w:rFonts w:ascii="Lato" w:hAnsi="Lato" w:cs="Times New Roman"/>
-          <w:i/>
-          <w:iCs/>
-        </w:rPr>
-        <w:t>, Louvain</w:t>
-      </w:r>
-    </w:p>
-    <w:p>
-      <w:pPr>
-        <w:pStyle w:val="ListBullet"/>
-        <w:numPr>
-          <w:ilvl w:val="0"/>
-          <w:numId w:val="23"/>
-        </w:numPr>
-        <w:ind w:left="530"/>
-        <w:jc w:val="both"/>
-        <w:rPr>
-          <w:rFonts w:ascii="Lato" w:hAnsi="Lato" w:cs="Times New Roman"/>
-        </w:rPr>
-      </w:pPr>
-      <w:r>
-        <w:rPr>
-          <w:rFonts w:ascii="Lato" w:hAnsi="Lato" w:cs="Times New Roman"/>
-        </w:rPr>
-        <w:t>Collected and processed 90,000 comments from Reddit and YouTube, performing large-scale cleaning and preprocessing</w:t>
-      </w:r>
-    </w:p>
-    <w:p>
-      <w:pPr>
-        <w:pStyle w:val="ListBullet"/>
-        <w:numPr>
-          <w:ilvl w:val="0"/>
-          <w:numId w:val="23"/>
-        </w:numPr>
-        <w:ind w:left="530"/>
-        <w:jc w:val="both"/>
-        <w:rPr>
-          <w:rFonts w:ascii="Lato" w:hAnsi="Lato" w:cs="Times New Roman"/>
-        </w:rPr>
-      </w:pPr>
-      <w:r>
-        <w:rPr>
-          <w:rFonts w:ascii="Lato" w:hAnsi="Lato" w:cs="Times New Roman"/>
-        </w:rPr>
-        <w:t>Built an NLP pipeline for sentiment analysis and LDA topic modeling to surface actionable insights</w:t>
-      </w:r>
-    </w:p>
-    <w:p>
-      <w:pPr>
-        <w:pStyle w:val="ListBullet"/>
-        <w:numPr>
-          <w:ilvl w:val="0"/>
-          <w:numId w:val="23"/>
-        </w:numPr>
-        <w:ind w:left="530"/>
-        <w:jc w:val="both"/>
-        <w:rPr>
-          <w:rFonts w:ascii="Lato" w:hAnsi="Lato" w:cs="Times New Roman"/>
-        </w:rPr>
-      </w:pPr>
-      <w:r>
-        <w:rPr>
-          <w:rFonts w:ascii="Lato" w:hAnsi="Lato" w:cs="Times New Roman"/>
-        </w:rPr>
-        <w:lastRenderedPageBreak/>
-        <w:t>Constructed interaction graphs, applied Louvain community detection, and simulated information diffusion using the Independent Cascade model</w:t>
-      </w:r>
-    </w:p>
-    <w:p>
-      <w:pPr>
-        <w:pStyle w:val="ListBullet"/>
-        <w:numPr>
-          <w:ilvl w:val="0"/>
-          <w:numId w:val="23"/>
-        </w:numPr>
-        <w:spacing w:after="120"/>
-        <w:ind w:left="530"/>
-        <w:jc w:val="both"/>
-        <w:rPr>
-          <w:rFonts w:ascii="Lato" w:hAnsi="Lato" w:cs="Times New Roman"/>
-        </w:rPr>
-      </w:pPr>
-      <w:r>
-        <w:rPr>
-          <w:rFonts w:ascii="Lato" w:hAnsi="Lato" w:cs="Times New Roman"/>
-        </w:rPr>
-        <w:t>Generated insights on sentiment polarization, topic diversity, and narrative spread across platforms</w:t>
-      </w:r>
-    </w:p>
-    <w:p>
-      <w:pPr>
-        <w:pStyle w:val="Heading2"/>
-        <w:spacing w:before="0" w:after="80"/>
-        <w:rPr>
-          <w:rFonts w:ascii="Lato" w:hAnsi="Lato" w:cs="Times New Roman"/>
-        </w:rPr>
-      </w:pPr>
-      <w:r>
-        <w:rPr>
-          <w:rFonts w:ascii="Lato" w:hAnsi="Lato" w:cs="Times New Roman"/>
-        </w:rPr>
-        <w:t>NLP Clothing Review Classification &amp; Web Application | RMIT</w:t>
-      </w:r>
-    </w:p>
-    <w:p>
-      <w:pPr>
-        <w:pStyle w:val="ListBullet"/>
-        <w:numPr>
-          <w:ilvl w:val="0"/>
-          <w:numId w:val="0"/>
-        </w:numPr>
-        <w:jc w:val="both"/>
-        <w:rPr>
-          <w:rFonts w:ascii="Lato" w:hAnsi="Lato" w:cs="Times New Roman"/>
-          <w:i/>
-          <w:iCs/>
-        </w:rPr>
-      </w:pPr>
-      <w:r>
-        <w:rPr>
-          <w:rFonts w:ascii="Lato" w:hAnsi="Lato" w:cs="Times New Roman"/>
-          <w:i/>
-          <w:iCs/>
-        </w:rPr>
-        <w:t xml:space="preserve">TensorFlow, </w:t>
-      </w:r>
-      <w:proofErr w:type="spellStart"/>
-      <w:r>
-        <w:rPr>
-          <w:rFonts w:ascii="Lato" w:hAnsi="Lato" w:cs="Times New Roman"/>
-          <w:i/>
-          <w:iCs/>
-        </w:rPr>
-        <w:t>FastText</w:t>
-      </w:r>
-      <w:proofErr w:type="spellEnd"/>
-      <w:r>
-        <w:rPr>
-          <w:rFonts w:ascii="Lato" w:hAnsi="Lato" w:cs="Times New Roman"/>
-          <w:i/>
-          <w:iCs/>
-        </w:rPr>
-        <w:t>, TF</w:t>
-      </w:r>
-      <w:r>
-        <w:rPr>
-          <w:rFonts w:ascii="Lato" w:hAnsi="Lato" w:cs="Times New Roman"/>
-          <w:i/>
-          <w:iCs/>
-        </w:rPr>
-        <w:noBreakHyphen/>
-        <w:t>IDF, Logistic Regression, Flask</w:t>
-      </w:r>
-    </w:p>
-    <w:p>
-      <w:pPr>
-        <w:pStyle w:val="ListBullet"/>
-        <w:numPr>
-          <w:ilvl w:val="0"/>
-          <w:numId w:val="24"/>
-        </w:numPr>
-        <w:ind w:left="530"/>
-        <w:jc w:val="both"/>
-        <w:rPr>
-          <w:rFonts w:ascii="Lato" w:hAnsi="Lato" w:cs="Times New Roman"/>
-        </w:rPr>
-      </w:pPr>
-      <w:r>
-        <w:rPr>
-          <w:rFonts w:ascii="Lato" w:hAnsi="Lato" w:cs="Times New Roman"/>
-        </w:rPr>
-        <w:t>Built end</w:t>
-      </w:r>
-      <w:r>
-        <w:rPr>
-          <w:rFonts w:ascii="Cambria Math" w:hAnsi="Cambria Math" w:cs="Cambria Math"/>
-        </w:rPr>
-        <w:t>‑</w:t>
-      </w:r>
-      <w:r>
-        <w:rPr>
-          <w:rFonts w:ascii="Lato" w:hAnsi="Lato" w:cs="Times New Roman"/>
-        </w:rPr>
-        <w:t>to</w:t>
-      </w:r>
-      <w:r>
-        <w:rPr>
-          <w:rFonts w:ascii="Cambria Math" w:hAnsi="Cambria Math" w:cs="Cambria Math"/>
-        </w:rPr>
-        <w:t>‑</w:t>
-      </w:r>
-      <w:r>
-        <w:rPr>
-          <w:rFonts w:ascii="Lato" w:hAnsi="Lato" w:cs="Times New Roman"/>
-        </w:rPr>
-        <w:t>end NLP pipelines for classifying product recommendations using text reviews</w:t>
-      </w:r>
-    </w:p>
-    <w:p>
-      <w:pPr>
-        <w:pStyle w:val="ListBullet"/>
-        <w:numPr>
-          <w:ilvl w:val="0"/>
-          <w:numId w:val="24"/>
-        </w:numPr>
-        <w:ind w:left="530"/>
-        <w:jc w:val="both"/>
-        <w:rPr>
-          <w:rFonts w:ascii="Lato" w:hAnsi="Lato" w:cs="Times New Roman"/>
-        </w:rPr>
-      </w:pPr>
-      <w:r>
-        <w:rPr>
-          <w:rFonts w:ascii="Lato" w:hAnsi="Lato" w:cs="Times New Roman"/>
-        </w:rPr>
-        <w:t xml:space="preserve">Implemented preprocessing: regex tokenization, </w:t>
-      </w:r>
-      <w:proofErr w:type="spellStart"/>
-      <w:r>
-        <w:rPr>
-          <w:rFonts w:ascii="Lato" w:hAnsi="Lato" w:cs="Times New Roman"/>
-        </w:rPr>
-        <w:t>stopword</w:t>
-      </w:r>
-      <w:proofErr w:type="spellEnd"/>
-      <w:r>
-        <w:rPr>
-          <w:rFonts w:ascii="Lato" w:hAnsi="Lato" w:cs="Times New Roman"/>
-        </w:rPr>
-        <w:t xml:space="preserve"> removal, rare</w:t>
-      </w:r>
-      <w:r>
-        <w:rPr>
-          <w:rFonts w:ascii="Cambria Math" w:hAnsi="Cambria Math" w:cs="Cambria Math"/>
-        </w:rPr>
-        <w:t>‑</w:t>
-      </w:r>
-      <w:r>
-        <w:rPr>
-          <w:rFonts w:ascii="Lato" w:hAnsi="Lato" w:cs="Times New Roman"/>
-        </w:rPr>
-        <w:t>word filtering, vocabulary creation</w:t>
-      </w:r>
-    </w:p>
-    <w:p>
-      <w:pPr>
-        <w:pStyle w:val="ListBullet"/>
-        <w:numPr>
-          <w:ilvl w:val="0"/>
-          <w:numId w:val="24"/>
-        </w:numPr>
-        <w:ind w:left="530"/>
-        <w:jc w:val="both"/>
-        <w:rPr>
-          <w:rFonts w:ascii="Lato" w:hAnsi="Lato" w:cs="Times New Roman"/>
-        </w:rPr>
-      </w:pPr>
-      <w:r>
-        <w:rPr>
-          <w:rFonts w:ascii="Lato" w:hAnsi="Lato" w:cs="Times New Roman"/>
-        </w:rPr>
-        <w:t>Generated Bag</w:t>
-      </w:r>
-      <w:r>
-        <w:rPr>
-          <w:rFonts w:ascii="Cambria Math" w:hAnsi="Cambria Math" w:cs="Cambria Math"/>
-        </w:rPr>
-        <w:t>‑</w:t>
-      </w:r>
-      <w:r>
-        <w:rPr>
-          <w:rFonts w:ascii="Lato" w:hAnsi="Lato" w:cs="Times New Roman"/>
-        </w:rPr>
-        <w:t>of</w:t>
-      </w:r>
-      <w:r>
-        <w:rPr>
-          <w:rFonts w:ascii="Cambria Math" w:hAnsi="Cambria Math" w:cs="Cambria Math"/>
-        </w:rPr>
-        <w:t>‑</w:t>
-      </w:r>
-      <w:r>
-        <w:rPr>
-          <w:rFonts w:ascii="Lato" w:hAnsi="Lato" w:cs="Times New Roman"/>
-        </w:rPr>
-        <w:t>Words, TF</w:t>
-      </w:r>
-      <w:r>
-        <w:rPr>
-          <w:rFonts w:ascii="Cambria Math" w:hAnsi="Cambria Math" w:cs="Cambria Math"/>
-        </w:rPr>
-        <w:t>‑</w:t>
-      </w:r>
-      <w:r>
-        <w:rPr>
-          <w:rFonts w:ascii="Lato" w:hAnsi="Lato" w:cs="Times New Roman"/>
-        </w:rPr>
-        <w:t>IDF, and embedding</w:t>
-      </w:r>
-      <w:r>
-        <w:rPr>
-          <w:rFonts w:ascii="Cambria Math" w:hAnsi="Cambria Math" w:cs="Cambria Math"/>
-        </w:rPr>
-        <w:t>‑</w:t>
-      </w:r>
-      <w:r>
-        <w:rPr>
-          <w:rFonts w:ascii="Lato" w:hAnsi="Lato" w:cs="Times New Roman"/>
-        </w:rPr>
-        <w:t>based document vectors for model training</w:t>
-      </w:r>
-    </w:p>
-    <w:p>
-      <w:pPr>
-        <w:pStyle w:val="ListBullet"/>
-        <w:numPr>
-          <w:ilvl w:val="0"/>
-          <w:numId w:val="24"/>
-        </w:numPr>
-        <w:ind w:left="530"/>
-        <w:jc w:val="both"/>
-        <w:rPr>
-          <w:rFonts w:ascii="Lato" w:hAnsi="Lato" w:cs="Times New Roman"/>
-        </w:rPr>
-      </w:pPr>
-      <w:r>
-        <w:rPr>
-          <w:rFonts w:ascii="Lato" w:hAnsi="Lato" w:cs="Times New Roman"/>
-        </w:rPr>
-        <w:t xml:space="preserve">Compared multiple ML </w:t>
-      </w:r>
-      <w:r>
-        <w:rPr>
-          <w:rFonts w:ascii="Calibri" w:hAnsi="Calibri" w:cs="Calibri"/>
-          <w:szCs w:val="20"/>
-        </w:rPr>
-        <w:t>models</w:t>
-      </w:r>
-      <w:r>
-        <w:rPr>
-          <w:rFonts w:ascii="Lato" w:hAnsi="Lato" w:cs="Times New Roman"/>
-        </w:rPr>
-        <w:t xml:space="preserve"> using </w:t>
-      </w:r>
-      <w:r>
-        <w:rPr>
-          <w:rFonts w:ascii="Lato" w:hAnsi="Lato" w:cs="Times New Roman"/>
-        </w:rPr>
-        <w:t>n</w:t>
-      </w:r>
-      <w:r>
-        <w:rPr>
-          <w:rFonts w:ascii="Cambria Math" w:hAnsi="Cambria Math" w:cs="Cambria Math"/>
-        </w:rPr>
-        <w:t>‑</w:t>
-      </w:r>
-      <w:r>
-        <w:rPr>
-          <w:rFonts w:ascii="Lato" w:hAnsi="Lato" w:cs="Times New Roman"/>
-        </w:rPr>
-        <w:t>fold cross</w:t>
-      </w:r>
-      <w:r>
-        <w:rPr>
-          <w:rFonts w:ascii="Cambria Math" w:hAnsi="Cambria Math" w:cs="Cambria Math"/>
-        </w:rPr>
-        <w:t>‑</w:t>
-      </w:r>
-      <w:r>
-        <w:rPr>
-          <w:rFonts w:ascii="Lato" w:hAnsi="Lato" w:cs="Times New Roman"/>
-        </w:rPr>
-        <w:t>validation and evaluation metrics</w:t>
-      </w:r>
-    </w:p>
-    <w:p>
-      <w:pPr>
-        <w:pStyle w:val="ListBullet"/>
-        <w:numPr>
-          <w:ilvl w:val="0"/>
-          <w:numId w:val="24"/>
-        </w:numPr>
-        <w:ind w:left="530"/>
-        <w:jc w:val="both"/>
-        <w:rPr>
-          <w:rFonts w:ascii="Lato" w:hAnsi="Lato" w:cs="Times New Roman"/>
-        </w:rPr>
-      </w:pPr>
-      <w:r>
-        <w:rPr>
-          <w:rFonts w:ascii="Lato" w:hAnsi="Lato" w:cs="Times New Roman"/>
-        </w:rPr>
-        <w:t>Developed a Flask</w:t>
-      </w:r>
-      <w:r>
-        <w:rPr>
-          <w:rFonts w:ascii="Cambria Math" w:hAnsi="Cambria Math" w:cs="Cambria Math"/>
-        </w:rPr>
-        <w:t>‑</w:t>
-      </w:r>
-      <w:r>
-        <w:rPr>
-          <w:rFonts w:ascii="Lato" w:hAnsi="Lato" w:cs="Times New Roman"/>
-        </w:rPr>
-        <w:t>based shopping website integrating the trained ML model for real</w:t>
-      </w:r>
-      <w:r>
-        <w:rPr>
-          <w:rFonts w:ascii="Cambria Math" w:hAnsi="Cambria Math" w:cs="Cambria Math"/>
-        </w:rPr>
-        <w:t>‑</w:t>
-      </w:r>
-      <w:r>
-        <w:rPr>
-          <w:rFonts w:ascii="Lato" w:hAnsi="Lato" w:cs="Times New Roman"/>
-        </w:rPr>
-        <w:t>time recommendation prediction</w:t>
-      </w:r>
-    </w:p>
-    <w:p>
-      <w:pPr>
-        <w:pStyle w:val="ListBullet"/>
-        <w:numPr>
-          <w:ilvl w:val="0"/>
-          <w:numId w:val="24"/>
-        </w:numPr>
-        <w:spacing w:after="120"/>
-        <w:ind w:left="530"/>
-        <w:jc w:val="both"/>
-        <w:rPr>
-          <w:rFonts w:ascii="Lato" w:hAnsi="Lato" w:cs="Times New Roman"/>
-        </w:rPr>
-      </w:pPr>
-      <w:r>
-        <w:rPr>
-          <w:rFonts w:ascii="Lato" w:hAnsi="Lato" w:cs="Times New Roman"/>
-        </w:rPr>
-        <w:t>Implemented keyword</w:t>
-      </w:r>
-      <w:r>
-        <w:rPr>
-          <w:rFonts w:ascii="Cambria Math" w:hAnsi="Cambria Math" w:cs="Cambria Math"/>
-        </w:rPr>
-        <w:t>‑</w:t>
-      </w:r>
-      <w:r>
-        <w:rPr>
-          <w:rFonts w:ascii="Lato" w:hAnsi="Lato" w:cs="Times New Roman"/>
-        </w:rPr>
-        <w:t>based search, item browsing, and user review submission with dynamic ML inference</w:t>
-      </w:r>
-    </w:p>
-    <w:p>
-      <w:pPr>
-        <w:pStyle w:val="Heading2"/>
-        <w:spacing w:before="0" w:after="80"/>
-        <w:rPr>
-          <w:rFonts w:ascii="Lato" w:hAnsi="Lato" w:cs="Times New Roman"/>
-        </w:rPr>
-      </w:pPr>
-      <w:r>
-        <w:rPr>
-          <w:rFonts w:ascii="Lato" w:hAnsi="Lato" w:cs="Times New Roman"/>
-        </w:rPr>
-        <w:t>Few</w:t>
-      </w:r>
-      <w:r>
-        <w:rPr>
-          <w:rFonts w:ascii="Lato" w:hAnsi="Lato" w:cs="Times New Roman"/>
-        </w:rPr>
-        <w:noBreakHyphen/>
-        <w:t>Shot Learning for Hyperspectral Data</w:t>
-      </w:r>
-      <w:r>
-        <w:rPr>
-          <w:rFonts w:ascii="Lato" w:hAnsi="Lato" w:cs="Times New Roman"/>
-        </w:rPr>
-        <w:t xml:space="preserve"> </w:t>
-      </w:r>
-      <w:r>
-        <w:rPr>
-          <w:rFonts w:ascii="Lato" w:hAnsi="Lato" w:cs="Times New Roman"/>
-        </w:rPr>
-        <w:t>| Final Year Project</w:t>
-      </w:r>
-      <w:r>
-        <w:rPr>
-          <w:rFonts w:ascii="Lato" w:hAnsi="Lato" w:cs="Times New Roman"/>
-        </w:rPr>
-        <w:t xml:space="preserve"> | IIT Bombay</w:t>
-      </w:r>
-    </w:p>
-    <w:p>
-      <w:pPr>
-        <w:pStyle w:val="ListBullet"/>
-        <w:numPr>
-          <w:ilvl w:val="0"/>
-          <w:numId w:val="0"/>
-        </w:numPr>
-        <w:jc w:val="both"/>
-        <w:rPr>
-          <w:rFonts w:ascii="Lato" w:hAnsi="Lato" w:cs="Times New Roman"/>
-          <w:i/>
-          <w:iCs/>
-        </w:rPr>
-      </w:pPr>
-      <w:proofErr w:type="spellStart"/>
-      <w:r>
-        <w:rPr>
-          <w:rFonts w:ascii="Lato" w:hAnsi="Lato" w:cs="Times New Roman"/>
-          <w:i/>
-          <w:iCs/>
-        </w:rPr>
-        <w:t>PyTorch</w:t>
-      </w:r>
-      <w:proofErr w:type="spellEnd"/>
-      <w:r>
-        <w:rPr>
-          <w:rFonts w:ascii="Lato" w:hAnsi="Lato" w:cs="Times New Roman"/>
-          <w:i/>
-          <w:iCs/>
-        </w:rPr>
-        <w:t>, TensorFlow, Deep Learning, Attention Mechanisms</w:t>
+        <w:t>Automated artist image retrieval and secure storage in S3, and integrated API Gateway with Lambda to handle user registration, subscription updates, and data retrieval via REST APIs</w:t>
       </w:r>
     </w:p>
     <w:bookmarkEnd w:id="1"/>
-    <w:p>
-      <w:pPr>
-        <w:pStyle w:val="ListBullet"/>
-        <w:numPr>
-          <w:ilvl w:val="0"/>
-          <w:numId w:val="22"/>
-        </w:numPr>
-        <w:jc w:val="both"/>
-        <w:rPr>
-          <w:rFonts w:ascii="Lato" w:hAnsi="Lato" w:cs="Times New Roman"/>
-          <w:lang w:val="en-AU"/>
-        </w:rPr>
-      </w:pPr>
-      <w:r>
-        <w:rPr>
-          <w:rFonts w:ascii="Lato" w:hAnsi="Lato" w:cs="Times New Roman"/>
-          <w:lang w:val="en-AU"/>
-        </w:rPr>
-        <w:t>Built a Few</w:t>
-      </w:r>
-      <w:r>
-        <w:rPr>
-          <w:rFonts w:ascii="Cambria Math" w:hAnsi="Cambria Math" w:cs="Cambria Math"/>
-          <w:lang w:val="en-AU"/>
-        </w:rPr>
-        <w:t>‑</w:t>
-      </w:r>
-      <w:r>
-        <w:rPr>
-          <w:rFonts w:ascii="Lato" w:hAnsi="Lato" w:cs="Times New Roman"/>
-          <w:lang w:val="en-AU"/>
-        </w:rPr>
-        <w:t>Shot Learning model for hyperspectral image classification using high</w:t>
-      </w:r>
-      <w:r>
-        <w:rPr>
-          <w:rFonts w:ascii="Cambria Math" w:hAnsi="Cambria Math" w:cs="Cambria Math"/>
-          <w:lang w:val="en-AU"/>
-        </w:rPr>
-        <w:t>‑</w:t>
-      </w:r>
-      <w:r>
-        <w:rPr>
-          <w:rFonts w:ascii="Lato" w:hAnsi="Lato" w:cs="Times New Roman"/>
-          <w:lang w:val="en-AU"/>
-        </w:rPr>
-        <w:t>dimensional spectral</w:t>
-      </w:r>
-      <w:r>
-        <w:rPr>
-          <w:rFonts w:ascii="Lato" w:hAnsi="Lato" w:cs="Lato"/>
-          <w:lang w:val="en-AU"/>
-        </w:rPr>
-        <w:t>–</w:t>
-      </w:r>
-      <w:r>
-        <w:rPr>
-          <w:rFonts w:ascii="Lato" w:hAnsi="Lato" w:cs="Times New Roman"/>
-          <w:lang w:val="en-AU"/>
-        </w:rPr>
-        <w:t>spatial data, integrating Temperature Scaling and Attention mechanisms to improve predictive reliability</w:t>
-      </w:r>
-    </w:p>
-    <w:p>
-      <w:pPr>
-        <w:pStyle w:val="ListBullet"/>
-        <w:numPr>
-          <w:ilvl w:val="0"/>
-          <w:numId w:val="22"/>
-        </w:numPr>
-        <w:jc w:val="both"/>
-        <w:rPr>
-          <w:rFonts w:ascii="Lato" w:hAnsi="Lato" w:cs="Times New Roman"/>
-          <w:lang w:val="en-AU"/>
-        </w:rPr>
-      </w:pPr>
-      <w:r>
-        <w:rPr>
-          <w:rFonts w:ascii="Lato" w:hAnsi="Lato" w:cs="Times New Roman"/>
-          <w:lang w:val="en-AU"/>
-        </w:rPr>
-        <w:t>Performed preprocessing and feature extraction on curated HSI datasets to address spectral–spatial variability and enhance model generalization</w:t>
-      </w:r>
-    </w:p>
-    <w:p>
-      <w:pPr>
-        <w:pStyle w:val="ListBullet"/>
-        <w:numPr>
-          <w:ilvl w:val="0"/>
-          <w:numId w:val="22"/>
-        </w:numPr>
-        <w:spacing w:after="120"/>
-        <w:jc w:val="both"/>
-        <w:rPr>
-          <w:rFonts w:ascii="Lato" w:hAnsi="Lato" w:cs="Times New Roman"/>
-          <w:lang w:val="en-AU"/>
-        </w:rPr>
-      </w:pPr>
-      <w:r>
-        <w:rPr>
-          <w:rFonts w:ascii="Lato" w:hAnsi="Lato" w:cs="Times New Roman"/>
-          <w:lang w:val="en-AU"/>
-        </w:rPr>
-        <w:t>Evaluated performance across multiple HSI benchmarks using cross</w:t>
-      </w:r>
-      <w:r>
-        <w:rPr>
-          <w:rFonts w:ascii="Cambria Math" w:hAnsi="Cambria Math" w:cs="Cambria Math"/>
-          <w:lang w:val="en-AU"/>
-        </w:rPr>
-        <w:t>‑</w:t>
-      </w:r>
-      <w:r>
-        <w:rPr>
-          <w:rFonts w:ascii="Lato" w:hAnsi="Lato" w:cs="Times New Roman"/>
-          <w:lang w:val="en-AU"/>
-        </w:rPr>
-        <w:t>validation and ablation studies to quantify the impact of architectural components and tuning strategies</w:t>
-      </w:r>
-    </w:p>
     <w:p>
       <w:pPr>
         <w:pStyle w:val="Heading1"/>
@@ -2669,10 +2425,11 @@
   <w:abstractNum w:abstractNumId="9" w15:restartNumberingAfterBreak="0">
     <w:nsid w:val="FFFFFF89"/>
     <w:multiLevelType w:val="singleLevel"/>
-    <w:tmpl w:val="FFB68862"/>
+    <w:tmpl w:val="DA5A6F0C"/>
     <w:lvl w:ilvl="0">
       <w:start w:val="1"/>
       <w:numFmt w:val="bullet"/>
+      <w:pStyle w:val="ListBullet"/>
       <w:lvlText w:val="·"/>
       <w:lvlJc w:val="left"/>
       <w:pPr>
@@ -4913,7 +4670,6 @@
   <w:style w:type="character" w:default="1" w:styleId="DefaultParagraphFont">
     <w:name w:val="Default Paragraph Font"/>
     <w:uiPriority w:val="1"/>
-    <w:semiHidden/>
     <w:unhideWhenUsed/>
   </w:style>
   <w:style w:type="table" w:default="1" w:styleId="TableNormal">
@@ -29853,13 +29609,6 @@
     <w:pitch w:val="variable"/>
     <w:sig w:usb0="E00006FF" w:usb1="420024FF" w:usb2="02000000" w:usb3="00000000" w:csb0="0000019F" w:csb1="00000000"/>
   </w:font>
-  <w:font w:name="Calibri">
-    <w:panose1 w:val="020F0502020204030204"/>
-    <w:charset w:val="00"/>
-    <w:family w:val="swiss"/>
-    <w:pitch w:val="variable"/>
-    <w:sig w:usb0="E4002EFF" w:usb1="C200247B" w:usb2="00000009" w:usb3="00000000" w:csb0="000001FF" w:csb1="00000000"/>
-  </w:font>
   <w:font w:name="Aptos">
     <w:charset w:val="00"/>
     <w:family w:val="swiss"/>
@@ -29894,6 +29643,7 @@
     <w:rsid w:val="0001651A"/>
     <w:rsid w:val="000421AE"/>
     <w:rsid w:val="00074D74"/>
+    <w:rsid w:val="00083134"/>
     <w:rsid w:val="00083DB9"/>
     <w:rsid w:val="000B3AE4"/>
     <w:rsid w:val="00166B4D"/>
@@ -29901,6 +29651,7 @@
     <w:rsid w:val="00203380"/>
     <w:rsid w:val="00231CC7"/>
     <w:rsid w:val="00232DDE"/>
+    <w:rsid w:val="002A7792"/>
     <w:rsid w:val="002B493B"/>
     <w:rsid w:val="002E003B"/>
     <w:rsid w:val="002E0C39"/>
@@ -29914,11 +29665,14 @@
     <w:rsid w:val="004E3344"/>
     <w:rsid w:val="005073E3"/>
     <w:rsid w:val="005377CD"/>
+    <w:rsid w:val="0055562C"/>
     <w:rsid w:val="00597329"/>
     <w:rsid w:val="005F4681"/>
     <w:rsid w:val="00626C2D"/>
+    <w:rsid w:val="00630AF8"/>
     <w:rsid w:val="006D1D96"/>
     <w:rsid w:val="006D1E7F"/>
+    <w:rsid w:val="006D5414"/>
     <w:rsid w:val="00724F98"/>
     <w:rsid w:val="007424F3"/>
     <w:rsid w:val="0074445F"/>
@@ -29932,14 +29686,18 @@
     <w:rsid w:val="008A17A1"/>
     <w:rsid w:val="008B6CF3"/>
     <w:rsid w:val="009161DA"/>
+    <w:rsid w:val="00966807"/>
+    <w:rsid w:val="00A21585"/>
     <w:rsid w:val="00B333A4"/>
     <w:rsid w:val="00B41D26"/>
     <w:rsid w:val="00B81510"/>
     <w:rsid w:val="00C03D0D"/>
     <w:rsid w:val="00C50774"/>
     <w:rsid w:val="00C6622F"/>
+    <w:rsid w:val="00CB6424"/>
     <w:rsid w:val="00CD2F75"/>
     <w:rsid w:val="00CE4E51"/>
+    <w:rsid w:val="00CE791D"/>
     <w:rsid w:val="00CF0E75"/>
     <w:rsid w:val="00D15F45"/>
     <w:rsid w:val="00D172AB"/>
@@ -29950,6 +29708,7 @@
     <w:rsid w:val="00EB38A9"/>
     <w:rsid w:val="00EB5184"/>
     <w:rsid w:val="00F02B06"/>
+    <w:rsid w:val="00F04D6B"/>
     <w:rsid w:val="00F27418"/>
     <w:rsid w:val="00FB203F"/>
     <w:rsid w:val="00FB3C96"/>
@@ -30699,6 +30458,39 @@
 </file>
 
 <file path=customXml/item1.xml><?xml version="1.0" encoding="utf-8"?>
+<b:Sources xmlns:b="http://schemas.openxmlformats.org/officeDocument/2006/bibliography" xmlns="http://schemas.openxmlformats.org/officeDocument/2006/bibliography" SelectedStyle="\APASixthEditionOfficeOnline.xsl" StyleName="APA" Version="6"/>
+</file>
+
+<file path=customXml/item2.xml><?xml version="1.0" encoding="utf-8"?>
+<p:properties xmlns:p="http://schemas.microsoft.com/office/2006/metadata/properties" xmlns:xsi="http://www.w3.org/2001/XMLSchema-instance" xmlns:pc="http://schemas.microsoft.com/office/infopath/2007/PartnerControls">
+  <documentManagement>
+    <_ip_UnifiedCompliancePolicyUIAction xmlns="http://schemas.microsoft.com/sharepoint/v3" xsi:nil="true"/>
+    <Image xmlns="71af3243-3dd4-4a8d-8c0d-dd76da1f02a5">
+      <Url xsi:nil="true"/>
+      <Description xsi:nil="true"/>
+    </Image>
+    <Status xmlns="71af3243-3dd4-4a8d-8c0d-dd76da1f02a5">Not started</Status>
+    <Background xmlns="71af3243-3dd4-4a8d-8c0d-dd76da1f02a5">false</Background>
+    <_ip_UnifiedCompliancePolicyProperties xmlns="http://schemas.microsoft.com/sharepoint/v3" xsi:nil="true"/>
+    <ImageTagsTaxHTField xmlns="71af3243-3dd4-4a8d-8c0d-dd76da1f02a5">
+      <Terms xmlns="http://schemas.microsoft.com/office/infopath/2007/PartnerControls"/>
+    </ImageTagsTaxHTField>
+    <TaxCatchAll xmlns="230e9df3-be65-4c73-a93b-d1236ebd677e" xsi:nil="true"/>
+    <MediaServiceKeyPoints xmlns="71af3243-3dd4-4a8d-8c0d-dd76da1f02a5" xsi:nil="true"/>
+  </documentManagement>
+</p:properties>
+</file>
+
+<file path=customXml/item3.xml><?xml version="1.0" encoding="utf-8"?>
+<?mso-contentType ?>
+<FormTemplates xmlns="http://schemas.microsoft.com/sharepoint/v3/contenttype/forms">
+  <Display>DocumentLibraryForm</Display>
+  <Edit>DocumentLibraryForm</Edit>
+  <New>DocumentLibraryForm</New>
+</FormTemplates>
+</file>
+
+<file path=customXml/item4.xml><?xml version="1.0" encoding="utf-8"?>
 <ct:contentTypeSchema xmlns:ct="http://schemas.microsoft.com/office/2006/metadata/contentType" xmlns:ma="http://schemas.microsoft.com/office/2006/metadata/properties/metaAttributes" ct:_="" ma:_="" ma:contentTypeName="Document" ma:contentTypeID="0x01010079F111ED35F8CC479449609E8A0923A6" ma:contentTypeVersion="26" ma:contentTypeDescription="Create a new document." ma:contentTypeScope="" ma:versionID="ac37c1753acd5e330d2062ccec26ea66">
   <xsd:schema xmlns:xsd="http://www.w3.org/2001/XMLSchema" xmlns:xs="http://www.w3.org/2001/XMLSchema" xmlns:p="http://schemas.microsoft.com/office/2006/metadata/properties" xmlns:ns1="http://schemas.microsoft.com/sharepoint/v3" xmlns:ns2="71af3243-3dd4-4a8d-8c0d-dd76da1f02a5" xmlns:ns3="16c05727-aa75-4e4a-9b5f-8a80a1165891" xmlns:ns4="230e9df3-be65-4c73-a93b-d1236ebd677e" targetNamespace="http://schemas.microsoft.com/office/2006/metadata/properties" ma:root="true" ma:fieldsID="3b340c7101c92c5120abd06486f94548" ns1:_="" ns2:_="" ns3:_="" ns4:_="">
     <xsd:import namespace="http://schemas.microsoft.com/sharepoint/v3"/>
@@ -30998,40 +30790,35 @@
 </ct:contentTypeSchema>
 </file>
 
-<file path=customXml/item2.xml><?xml version="1.0" encoding="utf-8"?>
-<?mso-contentType ?>
-<FormTemplates xmlns="http://schemas.microsoft.com/sharepoint/v3/contenttype/forms">
-  <Display>DocumentLibraryForm</Display>
-  <Edit>DocumentLibraryForm</Edit>
-  <New>DocumentLibraryForm</New>
-</FormTemplates>
+<file path=customXml/itemProps1.xml><?xml version="1.0" encoding="utf-8"?>
+<ds:datastoreItem xmlns:ds="http://schemas.openxmlformats.org/officeDocument/2006/customXml" ds:itemID="{B690CEF4-07C7-4C0C-A6BB-7328017E8EDA}">
+  <ds:schemaRefs>
+    <ds:schemaRef ds:uri="http://schemas.openxmlformats.org/officeDocument/2006/bibliography"/>
+  </ds:schemaRefs>
+</ds:datastoreItem>
 </file>
 
-<file path=customXml/item3.xml><?xml version="1.0" encoding="utf-8"?>
-<p:properties xmlns:p="http://schemas.microsoft.com/office/2006/metadata/properties" xmlns:xsi="http://www.w3.org/2001/XMLSchema-instance" xmlns:pc="http://schemas.microsoft.com/office/infopath/2007/PartnerControls">
-  <documentManagement>
-    <_ip_UnifiedCompliancePolicyUIAction xmlns="http://schemas.microsoft.com/sharepoint/v3" xsi:nil="true"/>
-    <Image xmlns="71af3243-3dd4-4a8d-8c0d-dd76da1f02a5">
-      <Url xsi:nil="true"/>
-      <Description xsi:nil="true"/>
-    </Image>
-    <Status xmlns="71af3243-3dd4-4a8d-8c0d-dd76da1f02a5">Not started</Status>
-    <Background xmlns="71af3243-3dd4-4a8d-8c0d-dd76da1f02a5">false</Background>
-    <_ip_UnifiedCompliancePolicyProperties xmlns="http://schemas.microsoft.com/sharepoint/v3" xsi:nil="true"/>
-    <ImageTagsTaxHTField xmlns="71af3243-3dd4-4a8d-8c0d-dd76da1f02a5">
-      <Terms xmlns="http://schemas.microsoft.com/office/infopath/2007/PartnerControls"/>
-    </ImageTagsTaxHTField>
-    <TaxCatchAll xmlns="230e9df3-be65-4c73-a93b-d1236ebd677e" xsi:nil="true"/>
-    <MediaServiceKeyPoints xmlns="71af3243-3dd4-4a8d-8c0d-dd76da1f02a5" xsi:nil="true"/>
-  </documentManagement>
-</p:properties>
+<file path=customXml/itemProps2.xml><?xml version="1.0" encoding="utf-8"?>
+<ds:datastoreItem xmlns:ds="http://schemas.openxmlformats.org/officeDocument/2006/customXml" ds:itemID="{A9893E80-0AB2-4C42-8D6E-F0C64251EDE9}">
+  <ds:schemaRefs>
+    <ds:schemaRef ds:uri="http://schemas.microsoft.com/office/2006/metadata/properties"/>
+    <ds:schemaRef ds:uri="http://schemas.microsoft.com/office/infopath/2007/PartnerControls"/>
+    <ds:schemaRef ds:uri="http://schemas.microsoft.com/sharepoint/v3"/>
+    <ds:schemaRef ds:uri="71af3243-3dd4-4a8d-8c0d-dd76da1f02a5"/>
+    <ds:schemaRef ds:uri="230e9df3-be65-4c73-a93b-d1236ebd677e"/>
+  </ds:schemaRefs>
+</ds:datastoreItem>
 </file>
 
-<file path=customXml/item4.xml><?xml version="1.0" encoding="utf-8"?>
-<b:Sources xmlns:b="http://schemas.openxmlformats.org/officeDocument/2006/bibliography" xmlns="http://schemas.openxmlformats.org/officeDocument/2006/bibliography" SelectedStyle="\APASixthEditionOfficeOnline.xsl" StyleName="APA" Version="6"/>
+<file path=customXml/itemProps3.xml><?xml version="1.0" encoding="utf-8"?>
+<ds:datastoreItem xmlns:ds="http://schemas.openxmlformats.org/officeDocument/2006/customXml" ds:itemID="{AABE5AEB-BD32-46FB-B4E8-5C314C3FA503}">
+  <ds:schemaRefs>
+    <ds:schemaRef ds:uri="http://schemas.microsoft.com/sharepoint/v3/contenttype/forms"/>
+  </ds:schemaRefs>
+</ds:datastoreItem>
 </file>
 
-<file path=customXml/itemProps1.xml><?xml version="1.0" encoding="utf-8"?>
+<file path=customXml/itemProps4.xml><?xml version="1.0" encoding="utf-8"?>
 <ds:datastoreItem xmlns:ds="http://schemas.openxmlformats.org/officeDocument/2006/customXml" ds:itemID="{46268ACC-32FC-4261-BF80-5F6DE34E1C11}">
   <ds:schemaRefs>
     <ds:schemaRef ds:uri="http://schemas.microsoft.com/office/2006/metadata/contentType"/>
@@ -31052,34 +30839,6 @@
 </ds:datastoreItem>
 </file>
 
-<file path=customXml/itemProps2.xml><?xml version="1.0" encoding="utf-8"?>
-<ds:datastoreItem xmlns:ds="http://schemas.openxmlformats.org/officeDocument/2006/customXml" ds:itemID="{AABE5AEB-BD32-46FB-B4E8-5C314C3FA503}">
-  <ds:schemaRefs>
-    <ds:schemaRef ds:uri="http://schemas.microsoft.com/sharepoint/v3/contenttype/forms"/>
-  </ds:schemaRefs>
-</ds:datastoreItem>
-</file>
-
-<file path=customXml/itemProps3.xml><?xml version="1.0" encoding="utf-8"?>
-<ds:datastoreItem xmlns:ds="http://schemas.openxmlformats.org/officeDocument/2006/customXml" ds:itemID="{A9893E80-0AB2-4C42-8D6E-F0C64251EDE9}">
-  <ds:schemaRefs>
-    <ds:schemaRef ds:uri="http://schemas.microsoft.com/office/2006/metadata/properties"/>
-    <ds:schemaRef ds:uri="http://schemas.microsoft.com/office/infopath/2007/PartnerControls"/>
-    <ds:schemaRef ds:uri="http://schemas.microsoft.com/sharepoint/v3"/>
-    <ds:schemaRef ds:uri="71af3243-3dd4-4a8d-8c0d-dd76da1f02a5"/>
-    <ds:schemaRef ds:uri="230e9df3-be65-4c73-a93b-d1236ebd677e"/>
-  </ds:schemaRefs>
-</ds:datastoreItem>
-</file>
-
-<file path=customXml/itemProps4.xml><?xml version="1.0" encoding="utf-8"?>
-<ds:datastoreItem xmlns:ds="http://schemas.openxmlformats.org/officeDocument/2006/customXml" ds:itemID="{B690CEF4-07C7-4C0C-A6BB-7328017E8EDA}">
-  <ds:schemaRefs>
-    <ds:schemaRef ds:uri="http://schemas.openxmlformats.org/officeDocument/2006/bibliography"/>
-  </ds:schemaRefs>
-</ds:datastoreItem>
-</file>
-
 <file path=docMetadata/LabelInfo.xml><?xml version="1.0" encoding="utf-8"?>
 <clbl:labelList xmlns:clbl="http://schemas.microsoft.com/office/2020/mipLabelMetadata"/>
 </file>
</xml_diff>

<commit_message>
Update resume to include location for Data Scientist Intern position
</commit_message>
<xml_diff>
--- a/public/Resume Mayank Kantharia.docx
+++ b/public/Resume Mayank Kantharia.docx
@@ -415,21 +415,7 @@
         <w:rPr>
           <w:rFonts w:ascii="Lato" w:hAnsi="Lato" w:cs="Times New Roman"/>
         </w:rPr>
-        <w:t xml:space="preserve">scikit-learn, </w:t>
-      </w:r>
-      <w:proofErr w:type="spellStart"/>
-      <w:r>
-        <w:rPr>
-          <w:rFonts w:ascii="Lato" w:hAnsi="Lato" w:cs="Times New Roman"/>
-        </w:rPr>
-        <w:t>PyTorch</w:t>
-      </w:r>
-      <w:proofErr w:type="spellEnd"/>
-      <w:r>
-        <w:rPr>
-          <w:rFonts w:ascii="Lato" w:hAnsi="Lato" w:cs="Times New Roman"/>
-        </w:rPr>
-        <w:t>, TensorFlow</w:t>
+        <w:t>scikit-learn, PyTorch, TensorFlow</w:t>
       </w:r>
       <w:r>
         <w:rPr>
@@ -594,14 +580,12 @@
         </w:rPr>
         <w:t xml:space="preserve"> </w:t>
       </w:r>
-      <w:proofErr w:type="spellStart"/>
       <w:r>
         <w:rPr>
           <w:rFonts w:ascii="Lato" w:hAnsi="Lato" w:cs="Times New Roman"/>
         </w:rPr>
         <w:t>FastAPI</w:t>
       </w:r>
-      <w:proofErr w:type="spellEnd"/>
       <w:r>
         <w:rPr>
           <w:rFonts w:ascii="Lato" w:hAnsi="Lato" w:cs="Times New Roman"/>
@@ -612,16 +596,8 @@
         <w:rPr>
           <w:rFonts w:ascii="Lato" w:hAnsi="Lato" w:cs="Times New Roman"/>
         </w:rPr>
-        <w:t xml:space="preserve"> </w:t>
+        <w:t xml:space="preserve"> Supabase</w:t>
       </w:r>
-      <w:proofErr w:type="spellStart"/>
-      <w:r>
-        <w:rPr>
-          <w:rFonts w:ascii="Lato" w:hAnsi="Lato" w:cs="Times New Roman"/>
-        </w:rPr>
-        <w:t>Supabase</w:t>
-      </w:r>
-      <w:proofErr w:type="spellEnd"/>
     </w:p>
     <w:p>
       <w:pPr>
@@ -643,16 +619,8 @@
         <w:rPr>
           <w:rFonts w:ascii="Lato" w:hAnsi="Lato" w:cs="Times New Roman"/>
         </w:rPr>
-        <w:t xml:space="preserve"> SQL, MongoDB, PostgreSQL, </w:t>
+        <w:t xml:space="preserve"> SQL, MongoDB, PostgreSQL, pgvector</w:t>
       </w:r>
-      <w:proofErr w:type="spellStart"/>
-      <w:r>
-        <w:rPr>
-          <w:rFonts w:ascii="Lato" w:hAnsi="Lato" w:cs="Times New Roman"/>
-        </w:rPr>
-        <w:t>pgvector</w:t>
-      </w:r>
-      <w:proofErr w:type="spellEnd"/>
       <w:r>
         <w:rPr>
           <w:rFonts w:ascii="Lato" w:hAnsi="Lato" w:cs="Times New Roman"/>
@@ -687,7 +655,6 @@
           <w:lang w:val="en-AU"/>
         </w:rPr>
       </w:pPr>
-      <w:proofErr w:type="spellStart"/>
       <w:r>
         <w:rPr>
           <w:rFonts w:ascii="Lato" w:hAnsi="Lato" w:cs="Times New Roman"/>
@@ -704,7 +671,6 @@
         </w:rPr>
         <w:t>n</w:t>
       </w:r>
-      <w:proofErr w:type="spellEnd"/>
       <w:r>
         <w:rPr>
           <w:rFonts w:ascii="Lato" w:hAnsi="Lato" w:cs="Times New Roman"/>
@@ -868,6 +834,14 @@
       <w:r>
         <w:rPr>
           <w:rFonts w:ascii="Lato" w:hAnsi="Lato" w:cs="Times New Roman"/>
+          <w:bCs/>
+          <w:color w:val="000000" w:themeColor="text1"/>
+        </w:rPr>
+        <w:t xml:space="preserve"> | Melbourne</w:t>
+      </w:r>
+      <w:r>
+        <w:rPr>
+          <w:rFonts w:ascii="Lato" w:hAnsi="Lato" w:cs="Times New Roman"/>
           <w:color w:val="000000" w:themeColor="text1"/>
         </w:rPr>
         <w:tab/>
@@ -940,21 +914,7 @@
         <w:rPr>
           <w:rFonts w:ascii="Lato" w:hAnsi="Lato" w:cs="Times New Roman"/>
         </w:rPr>
-        <w:t xml:space="preserve">Architected end-to-end RAG pipelines for </w:t>
-      </w:r>
-      <w:proofErr w:type="spellStart"/>
-      <w:r>
-        <w:rPr>
-          <w:rFonts w:ascii="Lato" w:hAnsi="Lato" w:cs="Times New Roman"/>
-        </w:rPr>
-        <w:t>personalised</w:t>
-      </w:r>
-      <w:proofErr w:type="spellEnd"/>
-      <w:r>
-        <w:rPr>
-          <w:rFonts w:ascii="Lato" w:hAnsi="Lato" w:cs="Times New Roman"/>
-        </w:rPr>
-        <w:t xml:space="preserve"> career guidance, achieving 3-second end-to-end latency and 5-millisecond vector searches, directly improving recommendation relevance and user experience</w:t>
+        <w:t>Architected end-to-end RAG pipelines for personalised career guidance, achieving 3-second end-to-end latency and 5-millisecond vector searches, directly improving recommendation relevance and user experience</w:t>
       </w:r>
     </w:p>
     <w:p>
@@ -992,21 +952,7 @@
         <w:rPr>
           <w:rFonts w:ascii="Lato" w:hAnsi="Lato" w:cs="Times New Roman"/>
         </w:rPr>
-        <w:t xml:space="preserve">Designed and deployed skill-gap analysis and semantic re-ranking services via </w:t>
-      </w:r>
-      <w:proofErr w:type="spellStart"/>
-      <w:r>
-        <w:rPr>
-          <w:rFonts w:ascii="Lato" w:hAnsi="Lato" w:cs="Times New Roman"/>
-        </w:rPr>
-        <w:t>FastAPI</w:t>
-      </w:r>
-      <w:proofErr w:type="spellEnd"/>
-      <w:r>
-        <w:rPr>
-          <w:rFonts w:ascii="Lato" w:hAnsi="Lato" w:cs="Times New Roman"/>
-        </w:rPr>
-        <w:t>, enabling accurate, context-aware role matching at production scale</w:t>
+        <w:t>Designed and deployed skill-gap analysis and semantic re-ranking services via FastAPI, enabling accurate, context-aware role matching at production scale</w:t>
       </w:r>
     </w:p>
     <w:p>
@@ -1026,21 +972,7 @@
         <w:rPr>
           <w:rFonts w:ascii="Lato" w:hAnsi="Lato" w:cs="Times New Roman"/>
         </w:rPr>
-        <w:t xml:space="preserve">Contributed to full-stack delivery across ML services and frontend roadmap </w:t>
-      </w:r>
-      <w:proofErr w:type="spellStart"/>
-      <w:r>
-        <w:rPr>
-          <w:rFonts w:ascii="Lato" w:hAnsi="Lato" w:cs="Times New Roman"/>
-        </w:rPr>
-        <w:t>visualisation</w:t>
-      </w:r>
-      <w:proofErr w:type="spellEnd"/>
-      <w:r>
-        <w:rPr>
-          <w:rFonts w:ascii="Lato" w:hAnsi="Lato" w:cs="Times New Roman"/>
-        </w:rPr>
-        <w:t xml:space="preserve"> components within an Agile team, while implementing logging and evaluation pipelines to support continuous experimentation</w:t>
+        <w:t>Contributed to full-stack delivery across ML services and frontend roadmap visualisation components within an Agile team, while implementing logging and evaluation pipelines to support continuous experimentation</w:t>
       </w:r>
     </w:p>
     <w:p>
@@ -1155,23 +1087,13 @@
         </w:rPr>
       </w:pPr>
       <w:bookmarkStart w:id="1" w:name="_Hlk213280283"/>
-      <w:proofErr w:type="gramStart"/>
       <w:r>
         <w:rPr>
           <w:rFonts w:ascii="Lato" w:hAnsi="Lato" w:cs="Times New Roman"/>
           <w:bCs/>
           <w:color w:val="000000" w:themeColor="text1"/>
         </w:rPr>
-        <w:t>Social Media</w:t>
-      </w:r>
-      <w:proofErr w:type="gramEnd"/>
-      <w:r>
-        <w:rPr>
-          <w:rFonts w:ascii="Lato" w:hAnsi="Lato" w:cs="Times New Roman"/>
-          <w:bCs/>
-          <w:color w:val="000000" w:themeColor="text1"/>
-        </w:rPr>
-        <w:t xml:space="preserve"> &amp; Network Analysis </w:t>
+        <w:t xml:space="preserve">Social Media &amp; Network Analysis </w:t>
       </w:r>
       <w:r>
         <w:rPr>
@@ -1228,27 +1150,7 @@
           <w:iCs/>
           <w:color w:val="404040" w:themeColor="text1" w:themeTint="BF"/>
         </w:rPr>
-        <w:t xml:space="preserve">Python, PRAW, YouTube API, NLP, LDA, VADER, </w:t>
-      </w:r>
-      <w:proofErr w:type="spellStart"/>
-      <w:r>
-        <w:rPr>
-          <w:rFonts w:ascii="Lato" w:hAnsi="Lato" w:cs="Times New Roman"/>
-          <w:i/>
-          <w:iCs/>
-          <w:color w:val="404040" w:themeColor="text1" w:themeTint="BF"/>
-        </w:rPr>
-        <w:t>NetworkX</w:t>
-      </w:r>
-      <w:proofErr w:type="spellEnd"/>
-      <w:r>
-        <w:rPr>
-          <w:rFonts w:ascii="Lato" w:hAnsi="Lato" w:cs="Times New Roman"/>
-          <w:i/>
-          <w:iCs/>
-          <w:color w:val="404040" w:themeColor="text1" w:themeTint="BF"/>
-        </w:rPr>
-        <w:t>, Louvain</w:t>
+        <w:t>Python, PRAW, YouTube API, NLP, LDA, VADER, NetworkX, Louvain</w:t>
       </w:r>
     </w:p>
     <w:p>
@@ -1268,21 +1170,7 @@
         <w:rPr>
           <w:rFonts w:ascii="Lato" w:hAnsi="Lato" w:cs="Times New Roman"/>
         </w:rPr>
-        <w:t xml:space="preserve">Collected and preprocessed 90,000+ comments from Reddit and YouTube, building an NLP pipeline using VADER sentiment analysis and LDA topic modelling to </w:t>
-      </w:r>
-      <w:proofErr w:type="spellStart"/>
-      <w:r>
-        <w:rPr>
-          <w:rFonts w:ascii="Lato" w:hAnsi="Lato" w:cs="Times New Roman"/>
-        </w:rPr>
-        <w:t>analyse</w:t>
-      </w:r>
-      <w:proofErr w:type="spellEnd"/>
-      <w:r>
-        <w:rPr>
-          <w:rFonts w:ascii="Lato" w:hAnsi="Lato" w:cs="Times New Roman"/>
-        </w:rPr>
-        <w:t xml:space="preserve"> cross-platform narrative patterns</w:t>
+        <w:t>Collected and preprocessed 90,000+ comments from Reddit and YouTube, building an NLP pipeline using VADER sentiment analysis and LDA topic modelling to analyse cross-platform narrative patterns</w:t>
       </w:r>
     </w:p>
     <w:p>
@@ -1302,49 +1190,7 @@
         <w:rPr>
           <w:rFonts w:ascii="Lato" w:hAnsi="Lato" w:cs="Times New Roman"/>
         </w:rPr>
-        <w:t xml:space="preserve">Detected platform-level </w:t>
-      </w:r>
-      <w:proofErr w:type="spellStart"/>
-      <w:r>
-        <w:rPr>
-          <w:rFonts w:ascii="Lato" w:hAnsi="Lato" w:cs="Times New Roman"/>
-        </w:rPr>
-        <w:t>behavioural</w:t>
-      </w:r>
-      <w:proofErr w:type="spellEnd"/>
-      <w:r>
-        <w:rPr>
-          <w:rFonts w:ascii="Lato" w:hAnsi="Lato" w:cs="Times New Roman"/>
-        </w:rPr>
-        <w:t xml:space="preserve"> divergence: YouTube exhibited </w:t>
-      </w:r>
-      <w:proofErr w:type="spellStart"/>
-      <w:r>
-        <w:rPr>
-          <w:rFonts w:ascii="Lato" w:hAnsi="Lato" w:cs="Times New Roman"/>
-        </w:rPr>
-        <w:t>centralised</w:t>
-      </w:r>
-      <w:proofErr w:type="spellEnd"/>
-      <w:r>
-        <w:rPr>
-          <w:rFonts w:ascii="Lato" w:hAnsi="Lato" w:cs="Times New Roman"/>
-        </w:rPr>
-        <w:t xml:space="preserve">, echo-chamber-like community structures (Louvain Q=0.895, 600 communities) compared to Reddit's </w:t>
-      </w:r>
-      <w:proofErr w:type="spellStart"/>
-      <w:r>
-        <w:rPr>
-          <w:rFonts w:ascii="Lato" w:hAnsi="Lato" w:cs="Times New Roman"/>
-        </w:rPr>
-        <w:t>decentralised</w:t>
-      </w:r>
-      <w:proofErr w:type="spellEnd"/>
-      <w:r>
-        <w:rPr>
-          <w:rFonts w:ascii="Lato" w:hAnsi="Lato" w:cs="Times New Roman"/>
-        </w:rPr>
-        <w:t xml:space="preserve"> discourse (Q=0.571, 237 communities)</w:t>
+        <w:t>Detected platform-level behavioural divergence: YouTube exhibited centralised, echo-chamber-like community structures (Louvain Q=0.895, 600 communities) compared to Reddit's decentralised discourse (Q=0.571, 237 communities)</w:t>
       </w:r>
     </w:p>
     <w:p>
@@ -1365,21 +1211,7 @@
         <w:rPr>
           <w:rFonts w:ascii="Lato" w:hAnsi="Lato" w:cs="Times New Roman"/>
         </w:rPr>
-        <w:t xml:space="preserve">Modelled information diffusion using the Independent Cascade algorithm, revealing YouTube's </w:t>
-      </w:r>
-      <w:proofErr w:type="spellStart"/>
-      <w:r>
-        <w:rPr>
-          <w:rFonts w:ascii="Lato" w:hAnsi="Lato" w:cs="Times New Roman"/>
-        </w:rPr>
-        <w:t>centralised</w:t>
-      </w:r>
-      <w:proofErr w:type="spellEnd"/>
-      <w:r>
-        <w:rPr>
-          <w:rFonts w:ascii="Lato" w:hAnsi="Lato" w:cs="Times New Roman"/>
-        </w:rPr>
-        <w:t xml:space="preserve"> hubs as amplifiers of emotionally charged, leader-focused content vs Reddit's broader geopolitical topic spread</w:t>
+        <w:t>Modelled information diffusion using the Independent Cascade algorithm, revealing YouTube's centralised hubs as amplifiers of emotionally charged, leader-focused content vs Reddit's broader geopolitical topic spread</w:t>
       </w:r>
     </w:p>
     <w:p>
@@ -1425,7 +1257,6 @@
           <w:color w:val="404040" w:themeColor="text1" w:themeTint="BF"/>
         </w:rPr>
       </w:pPr>
-      <w:proofErr w:type="spellStart"/>
       <w:r>
         <w:rPr>
           <w:rFonts w:ascii="Lato" w:hAnsi="Lato" w:cs="Times New Roman"/>
@@ -1433,17 +1264,7 @@
           <w:iCs/>
           <w:color w:val="404040" w:themeColor="text1" w:themeTint="BF"/>
         </w:rPr>
-        <w:t>PyTorch</w:t>
-      </w:r>
-      <w:proofErr w:type="spellEnd"/>
-      <w:r>
-        <w:rPr>
-          <w:rFonts w:ascii="Lato" w:hAnsi="Lato" w:cs="Times New Roman"/>
-          <w:i/>
-          <w:iCs/>
-          <w:color w:val="404040" w:themeColor="text1" w:themeTint="BF"/>
-        </w:rPr>
-        <w:t>, TensorFlow, Deep Learning, Attention Mechanisms</w:t>
+        <w:t>PyTorch, TensorFlow, Deep Learning, Attention Mechanisms</w:t>
       </w:r>
     </w:p>
     <w:p>
@@ -1564,27 +1385,7 @@
           <w:iCs/>
           <w:color w:val="404040" w:themeColor="text1" w:themeTint="BF"/>
         </w:rPr>
-        <w:t xml:space="preserve">TensorFlow, </w:t>
-      </w:r>
-      <w:proofErr w:type="spellStart"/>
-      <w:r>
-        <w:rPr>
-          <w:rFonts w:ascii="Lato" w:hAnsi="Lato" w:cs="Times New Roman"/>
-          <w:i/>
-          <w:iCs/>
-          <w:color w:val="404040" w:themeColor="text1" w:themeTint="BF"/>
-        </w:rPr>
-        <w:t>FastText</w:t>
-      </w:r>
-      <w:proofErr w:type="spellEnd"/>
-      <w:r>
-        <w:rPr>
-          <w:rFonts w:ascii="Lato" w:hAnsi="Lato" w:cs="Times New Roman"/>
-          <w:i/>
-          <w:iCs/>
-          <w:color w:val="404040" w:themeColor="text1" w:themeTint="BF"/>
-        </w:rPr>
-        <w:t>, TF</w:t>
+        <w:t>TensorFlow, FastText, TF</w:t>
       </w:r>
       <w:r>
         <w:rPr>
@@ -1614,21 +1415,7 @@
         <w:rPr>
           <w:rFonts w:ascii="Lato" w:hAnsi="Lato" w:cs="Times New Roman"/>
         </w:rPr>
-        <w:t xml:space="preserve">Engineered and benchmarked five feature representations (Bag-of-Words, TF-IDF, embeddings, title-only, combined), with the </w:t>
-      </w:r>
-      <w:proofErr w:type="spellStart"/>
-      <w:r>
-        <w:rPr>
-          <w:rFonts w:ascii="Lato" w:hAnsi="Lato" w:cs="Times New Roman"/>
-        </w:rPr>
-        <w:t>Title+Review</w:t>
-      </w:r>
-      <w:proofErr w:type="spellEnd"/>
-      <w:r>
-        <w:rPr>
-          <w:rFonts w:ascii="Lato" w:hAnsi="Lato" w:cs="Times New Roman"/>
-        </w:rPr>
-        <w:t xml:space="preserve"> combination achieving the highest mean accuracy of 88.97% across 5-fold cross-validation</w:t>
+        <w:t>Engineered and benchmarked five feature representations (Bag-of-Words, TF-IDF, embeddings, title-only, combined), with the Title+Review combination achieving the highest mean accuracy of 88.97% across 5-fold cross-validation</w:t>
       </w:r>
     </w:p>
     <w:p>
@@ -1649,21 +1436,7 @@
           <w:rFonts w:ascii="Lato" w:hAnsi="Lato" w:cs="Times New Roman"/>
         </w:rPr>
         <w:lastRenderedPageBreak/>
-        <w:t xml:space="preserve">Trained and compared multiple classifiers (Logistic Regression, </w:t>
-      </w:r>
-      <w:proofErr w:type="spellStart"/>
-      <w:r>
-        <w:rPr>
-          <w:rFonts w:ascii="Lato" w:hAnsi="Lato" w:cs="Times New Roman"/>
-        </w:rPr>
-        <w:t>FastText</w:t>
-      </w:r>
-      <w:proofErr w:type="spellEnd"/>
-      <w:r>
-        <w:rPr>
-          <w:rFonts w:ascii="Lato" w:hAnsi="Lato" w:cs="Times New Roman"/>
-        </w:rPr>
-        <w:t>, deep learning) to identify the optimal model, with combined text features consistently outperforming single-input baselines by up to 2.3%</w:t>
+        <w:t>Trained and compared multiple classifiers (Logistic Regression, FastText, deep learning) to identify the optimal model, with combined text features consistently outperforming single-input baselines by up to 2.3%</w:t>
       </w:r>
     </w:p>
     <w:p>
@@ -1798,21 +1571,7 @@
         <w:rPr>
           <w:rFonts w:ascii="Lato" w:hAnsi="Lato" w:cs="Times New Roman"/>
         </w:rPr>
-        <w:t xml:space="preserve">Designed DynamoDB schemas for login, music, and subscription data with </w:t>
-      </w:r>
-      <w:proofErr w:type="spellStart"/>
-      <w:r>
-        <w:rPr>
-          <w:rFonts w:ascii="Lato" w:hAnsi="Lato" w:cs="Times New Roman"/>
-        </w:rPr>
-        <w:t>optimised</w:t>
-      </w:r>
-      <w:proofErr w:type="spellEnd"/>
-      <w:r>
-        <w:rPr>
-          <w:rFonts w:ascii="Lato" w:hAnsi="Lato" w:cs="Times New Roman"/>
-        </w:rPr>
-        <w:t xml:space="preserve"> key structures and built backend logic for registration, subscription management, and music queries</w:t>
+        <w:t>Designed DynamoDB schemas for login, music, and subscription data with optimised key structures and built backend logic for registration, subscription management, and music queries</w:t>
       </w:r>
     </w:p>
     <w:p>
@@ -2429,7 +2188,6 @@
     <w:lvl w:ilvl="0">
       <w:start w:val="1"/>
       <w:numFmt w:val="bullet"/>
-      <w:pStyle w:val="ListBullet"/>
       <w:lvlText w:val="·"/>
       <w:lvlJc w:val="left"/>
       <w:pPr>
@@ -4670,6 +4428,7 @@
   <w:style w:type="character" w:default="1" w:styleId="DefaultParagraphFont">
     <w:name w:val="Default Paragraph Font"/>
     <w:uiPriority w:val="1"/>
+    <w:semiHidden/>
     <w:unhideWhenUsed/>
   </w:style>
   <w:style w:type="table" w:default="1" w:styleId="TableNormal">
@@ -29657,6 +29416,7 @@
     <w:rsid w:val="002E0C39"/>
     <w:rsid w:val="002E4C8F"/>
     <w:rsid w:val="00342027"/>
+    <w:rsid w:val="00411B2F"/>
     <w:rsid w:val="00426A38"/>
     <w:rsid w:val="0043450B"/>
     <w:rsid w:val="00444BA4"/>
@@ -29702,6 +29462,7 @@
     <w:rsid w:val="00D15F45"/>
     <w:rsid w:val="00D172AB"/>
     <w:rsid w:val="00D76F55"/>
+    <w:rsid w:val="00D85004"/>
     <w:rsid w:val="00DF2088"/>
     <w:rsid w:val="00E26E6D"/>
     <w:rsid w:val="00EA60EF"/>
@@ -30458,10 +30219,6 @@
 </file>
 
 <file path=customXml/item1.xml><?xml version="1.0" encoding="utf-8"?>
-<b:Sources xmlns:b="http://schemas.openxmlformats.org/officeDocument/2006/bibliography" xmlns="http://schemas.openxmlformats.org/officeDocument/2006/bibliography" SelectedStyle="\APASixthEditionOfficeOnline.xsl" StyleName="APA" Version="6"/>
-</file>
-
-<file path=customXml/item2.xml><?xml version="1.0" encoding="utf-8"?>
 <p:properties xmlns:p="http://schemas.microsoft.com/office/2006/metadata/properties" xmlns:xsi="http://www.w3.org/2001/XMLSchema-instance" xmlns:pc="http://schemas.microsoft.com/office/infopath/2007/PartnerControls">
   <documentManagement>
     <_ip_UnifiedCompliancePolicyUIAction xmlns="http://schemas.microsoft.com/sharepoint/v3" xsi:nil="true"/>
@@ -30481,16 +30238,11 @@
 </p:properties>
 </file>
 
-<file path=customXml/item3.xml><?xml version="1.0" encoding="utf-8"?>
-<?mso-contentType ?>
-<FormTemplates xmlns="http://schemas.microsoft.com/sharepoint/v3/contenttype/forms">
-  <Display>DocumentLibraryForm</Display>
-  <Edit>DocumentLibraryForm</Edit>
-  <New>DocumentLibraryForm</New>
-</FormTemplates>
+<file path=customXml/item2.xml><?xml version="1.0" encoding="utf-8"?>
+<b:Sources xmlns:b="http://schemas.openxmlformats.org/officeDocument/2006/bibliography" xmlns="http://schemas.openxmlformats.org/officeDocument/2006/bibliography" SelectedStyle="\APASixthEditionOfficeOnline.xsl" StyleName="APA" Version="6"/>
 </file>
 
-<file path=customXml/item4.xml><?xml version="1.0" encoding="utf-8"?>
+<file path=customXml/item3.xml><?xml version="1.0" encoding="utf-8"?>
 <ct:contentTypeSchema xmlns:ct="http://schemas.microsoft.com/office/2006/metadata/contentType" xmlns:ma="http://schemas.microsoft.com/office/2006/metadata/properties/metaAttributes" ct:_="" ma:_="" ma:contentTypeName="Document" ma:contentTypeID="0x01010079F111ED35F8CC479449609E8A0923A6" ma:contentTypeVersion="26" ma:contentTypeDescription="Create a new document." ma:contentTypeScope="" ma:versionID="ac37c1753acd5e330d2062ccec26ea66">
   <xsd:schema xmlns:xsd="http://www.w3.org/2001/XMLSchema" xmlns:xs="http://www.w3.org/2001/XMLSchema" xmlns:p="http://schemas.microsoft.com/office/2006/metadata/properties" xmlns:ns1="http://schemas.microsoft.com/sharepoint/v3" xmlns:ns2="71af3243-3dd4-4a8d-8c0d-dd76da1f02a5" xmlns:ns3="16c05727-aa75-4e4a-9b5f-8a80a1165891" xmlns:ns4="230e9df3-be65-4c73-a93b-d1236ebd677e" targetNamespace="http://schemas.microsoft.com/office/2006/metadata/properties" ma:root="true" ma:fieldsID="3b340c7101c92c5120abd06486f94548" ns1:_="" ns2:_="" ns3:_="" ns4:_="">
     <xsd:import namespace="http://schemas.microsoft.com/sharepoint/v3"/>
@@ -30790,15 +30542,16 @@
 </ct:contentTypeSchema>
 </file>
 
-<file path=customXml/itemProps1.xml><?xml version="1.0" encoding="utf-8"?>
-<ds:datastoreItem xmlns:ds="http://schemas.openxmlformats.org/officeDocument/2006/customXml" ds:itemID="{B690CEF4-07C7-4C0C-A6BB-7328017E8EDA}">
-  <ds:schemaRefs>
-    <ds:schemaRef ds:uri="http://schemas.openxmlformats.org/officeDocument/2006/bibliography"/>
-  </ds:schemaRefs>
-</ds:datastoreItem>
+<file path=customXml/item4.xml><?xml version="1.0" encoding="utf-8"?>
+<?mso-contentType ?>
+<FormTemplates xmlns="http://schemas.microsoft.com/sharepoint/v3/contenttype/forms">
+  <Display>DocumentLibraryForm</Display>
+  <Edit>DocumentLibraryForm</Edit>
+  <New>DocumentLibraryForm</New>
+</FormTemplates>
 </file>
 
-<file path=customXml/itemProps2.xml><?xml version="1.0" encoding="utf-8"?>
+<file path=customXml/itemProps1.xml><?xml version="1.0" encoding="utf-8"?>
 <ds:datastoreItem xmlns:ds="http://schemas.openxmlformats.org/officeDocument/2006/customXml" ds:itemID="{A9893E80-0AB2-4C42-8D6E-F0C64251EDE9}">
   <ds:schemaRefs>
     <ds:schemaRef ds:uri="http://schemas.microsoft.com/office/2006/metadata/properties"/>
@@ -30810,15 +30563,15 @@
 </ds:datastoreItem>
 </file>
 
-<file path=customXml/itemProps3.xml><?xml version="1.0" encoding="utf-8"?>
-<ds:datastoreItem xmlns:ds="http://schemas.openxmlformats.org/officeDocument/2006/customXml" ds:itemID="{AABE5AEB-BD32-46FB-B4E8-5C314C3FA503}">
+<file path=customXml/itemProps2.xml><?xml version="1.0" encoding="utf-8"?>
+<ds:datastoreItem xmlns:ds="http://schemas.openxmlformats.org/officeDocument/2006/customXml" ds:itemID="{B690CEF4-07C7-4C0C-A6BB-7328017E8EDA}">
   <ds:schemaRefs>
-    <ds:schemaRef ds:uri="http://schemas.microsoft.com/sharepoint/v3/contenttype/forms"/>
+    <ds:schemaRef ds:uri="http://schemas.openxmlformats.org/officeDocument/2006/bibliography"/>
   </ds:schemaRefs>
 </ds:datastoreItem>
 </file>
 
-<file path=customXml/itemProps4.xml><?xml version="1.0" encoding="utf-8"?>
+<file path=customXml/itemProps3.xml><?xml version="1.0" encoding="utf-8"?>
 <ds:datastoreItem xmlns:ds="http://schemas.openxmlformats.org/officeDocument/2006/customXml" ds:itemID="{46268ACC-32FC-4261-BF80-5F6DE34E1C11}">
   <ds:schemaRefs>
     <ds:schemaRef ds:uri="http://schemas.microsoft.com/office/2006/metadata/contentType"/>
@@ -30839,6 +30592,14 @@
 </ds:datastoreItem>
 </file>
 
+<file path=customXml/itemProps4.xml><?xml version="1.0" encoding="utf-8"?>
+<ds:datastoreItem xmlns:ds="http://schemas.openxmlformats.org/officeDocument/2006/customXml" ds:itemID="{AABE5AEB-BD32-46FB-B4E8-5C314C3FA503}">
+  <ds:schemaRefs>
+    <ds:schemaRef ds:uri="http://schemas.microsoft.com/sharepoint/v3/contenttype/forms"/>
+  </ds:schemaRefs>
+</ds:datastoreItem>
+</file>
+
 <file path=docMetadata/LabelInfo.xml><?xml version="1.0" encoding="utf-8"?>
 <clbl:labelList xmlns:clbl="http://schemas.microsoft.com/office/2020/mipLabelMetadata"/>
 </file>
</xml_diff>